<commit_message>
création du js pour questionnaire
</commit_message>
<xml_diff>
--- a/OdooScope.docx
+++ b/OdooScope.docx
@@ -7432,64 +7432,74 @@
         <w:t>Logique de code</w:t>
       </w:r>
     </w:p>
+    <w:p>
+      <w:r>
+        <w:t>Login/sans login</w:t>
+      </w:r>
+    </w:p>
+    <w:p>
+      <w:r>
+        <w:t>Sera implémenter directement dans Odoo dans le futur, le programme sera donc derrière le login Odoo donc pas besoins de faire une page de login.</w:t>
+      </w:r>
+    </w:p>
+    <w:p>
+      <w:pPr>
+        <w:pStyle w:val="Titre2"/>
+      </w:pPr>
+      <w:bookmarkStart w:id="24" w:name="_Toc229378744"/>
+      <w:r>
+        <w:t>Visuels</w:t>
+      </w:r>
+      <w:bookmarkEnd w:id="24"/>
+    </w:p>
+    <w:p>
+      <w:pPr>
+        <w:pStyle w:val="Titre3"/>
+      </w:pPr>
+      <w:bookmarkStart w:id="25" w:name="_Toc229378745"/>
+      <w:r>
+        <w:t>Choix visuels</w:t>
+      </w:r>
+      <w:bookmarkEnd w:id="25"/>
+    </w:p>
     <w:p/>
     <w:p>
       <w:pPr>
+        <w:pStyle w:val="Titre3"/>
+      </w:pPr>
+      <w:bookmarkStart w:id="26" w:name="_Toc229378746"/>
+      <w:r>
+        <w:t>Bibliothèque et ressources</w:t>
+      </w:r>
+      <w:bookmarkEnd w:id="26"/>
+    </w:p>
+    <w:p/>
+    <w:p>
+      <w:pPr>
         <w:pStyle w:val="Titre2"/>
       </w:pPr>
-      <w:bookmarkStart w:id="24" w:name="_Toc229378744"/>
-      <w:r>
-        <w:t>Visuels</w:t>
-      </w:r>
-      <w:bookmarkEnd w:id="24"/>
+      <w:bookmarkStart w:id="27" w:name="_Toc229378747"/>
+      <w:r>
+        <w:t>Mode d’emplois</w:t>
+      </w:r>
+      <w:bookmarkEnd w:id="27"/>
+    </w:p>
+    <w:p/>
+    <w:p>
+      <w:pPr>
+        <w:pStyle w:val="Titre2"/>
+      </w:pPr>
+      <w:bookmarkStart w:id="28" w:name="_Toc229378748"/>
+      <w:r>
+        <w:lastRenderedPageBreak/>
+        <w:t>Evolutions futures</w:t>
+      </w:r>
+      <w:bookmarkEnd w:id="28"/>
     </w:p>
     <w:p>
       <w:pPr>
         <w:pStyle w:val="Titre3"/>
       </w:pPr>
-      <w:bookmarkStart w:id="25" w:name="_Toc229378745"/>
-      <w:r>
-        <w:t>Choix visuels</w:t>
-      </w:r>
-      <w:bookmarkEnd w:id="25"/>
-    </w:p>
-    <w:p/>
-    <w:p>
-      <w:pPr>
-        <w:pStyle w:val="Titre3"/>
-      </w:pPr>
-      <w:bookmarkStart w:id="26" w:name="_Toc229378746"/>
-      <w:r>
-        <w:t>Bibliothèque et ressources</w:t>
-      </w:r>
-      <w:bookmarkEnd w:id="26"/>
-    </w:p>
-    <w:p/>
-    <w:p>
-      <w:pPr>
-        <w:pStyle w:val="Titre2"/>
-      </w:pPr>
-      <w:bookmarkStart w:id="27" w:name="_Toc229378747"/>
-      <w:r>
-        <w:t>Mode d’emplois</w:t>
-      </w:r>
-      <w:bookmarkEnd w:id="27"/>
-    </w:p>
-    <w:p/>
-    <w:p>
-      <w:pPr>
-        <w:pStyle w:val="Titre2"/>
-      </w:pPr>
-      <w:bookmarkStart w:id="28" w:name="_Toc229378748"/>
-      <w:r>
-        <w:t>Evolutions futures</w:t>
-      </w:r>
-      <w:bookmarkEnd w:id="28"/>
-    </w:p>
-    <w:p>
-      <w:pPr>
-        <w:pStyle w:val="Titre3"/>
-      </w:pPr>
       <w:bookmarkStart w:id="29" w:name="_Toc229378749"/>
       <w:r>
         <w:t>Orienté client</w:t>
@@ -7501,7 +7511,6 @@
     </w:p>
     <w:p>
       <w:r>
-        <w:lastRenderedPageBreak/>
         <w:t xml:space="preserve">Nous avons comme futur objectif d’adapter le questionnaire afin de rendre plus adapté à une utilisation par les clients potentiels de blackbox. L’objectif d’amélioration est de pourvoir, en fonction des réponses, proposer non seulement une liste d’application nécessaire avec une vue commerciale de l’utilisation d’Odoo avec des processus de travail expliqués probablement en vidéo afin de démontrer son utilisation en condition réelle. De plus, une automatisation directe dans le CRM Odoo pourra nous permettre de proposer rapidement selon les informations remplies un devis provisoire du tarif de l’intégration et </w:t>
       </w:r>
       <w:r>

</xml_diff>

<commit_message>
fin de code, modif document
</commit_message>
<xml_diff>
--- a/OdooScope.docx
+++ b/OdooScope.docx
@@ -55,13 +55,73 @@
           <w:noProof/>
         </w:rPr>
         <w:drawing>
-          <wp:anchor distT="0" distB="0" distL="114300" distR="114300" simplePos="0" relativeHeight="251659264" behindDoc="0" locked="0" layoutInCell="1" allowOverlap="1" wp14:anchorId="1986E7DC" wp14:editId="18A9C8AA">
+          <wp:anchor distT="0" distB="0" distL="114300" distR="114300" simplePos="0" relativeHeight="251664384" behindDoc="1" locked="0" layoutInCell="1" allowOverlap="1" wp14:anchorId="208F71E7" wp14:editId="4EE9EB0A">
             <wp:simplePos x="0" y="0"/>
             <wp:positionH relativeFrom="margin">
-              <wp:posOffset>-10589</wp:posOffset>
+              <wp:posOffset>3607435</wp:posOffset>
+            </wp:positionH>
+            <wp:positionV relativeFrom="paragraph">
+              <wp:posOffset>5355590</wp:posOffset>
+            </wp:positionV>
+            <wp:extent cx="2160000" cy="697773"/>
+            <wp:effectExtent l="0" t="0" r="0" b="7620"/>
+            <wp:wrapNone/>
+            <wp:docPr id="729987482" name="Image 3" descr="ooo&#10;&#10;Le contenu généré par l’IA peut être incorrect."/>
+            <wp:cNvGraphicFramePr>
+              <a:graphicFrameLocks xmlns:a="http://schemas.openxmlformats.org/drawingml/2006/main" noChangeAspect="1"/>
+            </wp:cNvGraphicFramePr>
+            <a:graphic xmlns:a="http://schemas.openxmlformats.org/drawingml/2006/main">
+              <a:graphicData uri="http://schemas.openxmlformats.org/drawingml/2006/picture">
+                <pic:pic xmlns:pic="http://schemas.openxmlformats.org/drawingml/2006/picture">
+                  <pic:nvPicPr>
+                    <pic:cNvPr id="729987482" name="Image 3" descr="ooo&#10;&#10;Le contenu généré par l’IA peut être incorrect."/>
+                    <pic:cNvPicPr/>
+                  </pic:nvPicPr>
+                  <pic:blipFill>
+                    <a:blip r:embed="rId8" cstate="print">
+                      <a:extLst>
+                        <a:ext uri="{28A0092B-C50C-407E-A947-70E740481C1C}">
+                          <a14:useLocalDpi xmlns:a14="http://schemas.microsoft.com/office/drawing/2010/main" val="0"/>
+                        </a:ext>
+                      </a:extLst>
+                    </a:blip>
+                    <a:stretch>
+                      <a:fillRect/>
+                    </a:stretch>
+                  </pic:blipFill>
+                  <pic:spPr>
+                    <a:xfrm>
+                      <a:off x="0" y="0"/>
+                      <a:ext cx="2160000" cy="697773"/>
+                    </a:xfrm>
+                    <a:prstGeom prst="rect">
+                      <a:avLst/>
+                    </a:prstGeom>
+                  </pic:spPr>
+                </pic:pic>
+              </a:graphicData>
+            </a:graphic>
+            <wp14:sizeRelH relativeFrom="margin">
+              <wp14:pctWidth>0</wp14:pctWidth>
+            </wp14:sizeRelH>
+            <wp14:sizeRelV relativeFrom="margin">
+              <wp14:pctHeight>0</wp14:pctHeight>
+            </wp14:sizeRelV>
+          </wp:anchor>
+        </w:drawing>
+      </w:r>
+      <w:r>
+        <w:rPr>
+          <w:noProof/>
+        </w:rPr>
+        <w:drawing>
+          <wp:anchor distT="0" distB="0" distL="114300" distR="114300" simplePos="0" relativeHeight="251659264" behindDoc="0" locked="0" layoutInCell="1" allowOverlap="1" wp14:anchorId="1986E7DC" wp14:editId="7B1D9A0F">
+            <wp:simplePos x="0" y="0"/>
+            <wp:positionH relativeFrom="margin">
+              <wp:posOffset>-10160</wp:posOffset>
             </wp:positionH>
             <wp:positionV relativeFrom="margin">
-              <wp:posOffset>3014980</wp:posOffset>
+              <wp:posOffset>2208530</wp:posOffset>
             </wp:positionV>
             <wp:extent cx="5760720" cy="2734945"/>
             <wp:effectExtent l="152400" t="152400" r="354330" b="370205"/>
@@ -78,7 +138,7 @@
                     <pic:cNvPicPr/>
                   </pic:nvPicPr>
                   <pic:blipFill>
-                    <a:blip r:embed="rId7" cstate="print">
+                    <a:blip r:embed="rId9" cstate="print">
                       <a:extLst>
                         <a:ext uri="{28A0092B-C50C-407E-A947-70E740481C1C}">
                           <a14:useLocalDpi xmlns:a14="http://schemas.microsoft.com/office/drawing/2010/main" val="0"/>
@@ -115,6 +175,66 @@
               <wp14:pctWidth>0</wp14:pctWidth>
             </wp14:sizeRelH>
             <wp14:sizeRelV relativeFrom="page">
+              <wp14:pctHeight>0</wp14:pctHeight>
+            </wp14:sizeRelV>
+          </wp:anchor>
+        </w:drawing>
+      </w:r>
+      <w:r>
+        <w:rPr>
+          <w:noProof/>
+        </w:rPr>
+        <w:drawing>
+          <wp:anchor distT="0" distB="0" distL="114300" distR="114300" simplePos="0" relativeHeight="251663360" behindDoc="1" locked="0" layoutInCell="1" allowOverlap="1" wp14:anchorId="75DC5101" wp14:editId="44A8AFC7">
+            <wp:simplePos x="0" y="0"/>
+            <wp:positionH relativeFrom="margin">
+              <wp:posOffset>0</wp:posOffset>
+            </wp:positionH>
+            <wp:positionV relativeFrom="paragraph">
+              <wp:posOffset>5158740</wp:posOffset>
+            </wp:positionV>
+            <wp:extent cx="1080000" cy="1236736"/>
+            <wp:effectExtent l="0" t="0" r="6350" b="1905"/>
+            <wp:wrapNone/>
+            <wp:docPr id="1482388818" name="Image 2" descr="Blackbox Speak Digital&#10;&#10;Le contenu généré par l’IA peut être incorrect."/>
+            <wp:cNvGraphicFramePr>
+              <a:graphicFrameLocks xmlns:a="http://schemas.openxmlformats.org/drawingml/2006/main" noChangeAspect="1"/>
+            </wp:cNvGraphicFramePr>
+            <a:graphic xmlns:a="http://schemas.openxmlformats.org/drawingml/2006/main">
+              <a:graphicData uri="http://schemas.openxmlformats.org/drawingml/2006/picture">
+                <pic:pic xmlns:pic="http://schemas.openxmlformats.org/drawingml/2006/picture">
+                  <pic:nvPicPr>
+                    <pic:cNvPr id="1482388818" name="Image 2" descr="Blackbox Speak Digital&#10;&#10;Le contenu généré par l’IA peut être incorrect."/>
+                    <pic:cNvPicPr/>
+                  </pic:nvPicPr>
+                  <pic:blipFill>
+                    <a:blip r:embed="rId10" cstate="print">
+                      <a:extLst>
+                        <a:ext uri="{28A0092B-C50C-407E-A947-70E740481C1C}">
+                          <a14:useLocalDpi xmlns:a14="http://schemas.microsoft.com/office/drawing/2010/main" val="0"/>
+                        </a:ext>
+                      </a:extLst>
+                    </a:blip>
+                    <a:stretch>
+                      <a:fillRect/>
+                    </a:stretch>
+                  </pic:blipFill>
+                  <pic:spPr>
+                    <a:xfrm>
+                      <a:off x="0" y="0"/>
+                      <a:ext cx="1080000" cy="1236736"/>
+                    </a:xfrm>
+                    <a:prstGeom prst="rect">
+                      <a:avLst/>
+                    </a:prstGeom>
+                  </pic:spPr>
+                </pic:pic>
+              </a:graphicData>
+            </a:graphic>
+            <wp14:sizeRelH relativeFrom="margin">
+              <wp14:pctWidth>0</wp14:pctWidth>
+            </wp14:sizeRelH>
+            <wp14:sizeRelV relativeFrom="margin">
               <wp14:pctHeight>0</wp14:pctHeight>
             </wp14:sizeRelV>
           </wp:anchor>
@@ -1992,267 +2112,268 @@
         <w:br w:type="page"/>
       </w:r>
     </w:p>
+    <w:p>
+      <w:pPr>
+        <w:pStyle w:val="Titre2"/>
+      </w:pPr>
+      <w:bookmarkStart w:id="7" w:name="_Toc229378726"/>
+      <w:r>
+        <w:lastRenderedPageBreak/>
+        <w:t>Présentation de l’application</w:t>
+      </w:r>
+      <w:bookmarkEnd w:id="7"/>
+    </w:p>
     <w:p/>
     <w:p>
       <w:pPr>
+        <w:pStyle w:val="Titre3"/>
+      </w:pPr>
+      <w:bookmarkStart w:id="8" w:name="_Toc229378727"/>
+      <w:r>
+        <w:t>Présentation blackbox</w:t>
+      </w:r>
+      <w:bookmarkEnd w:id="8"/>
+    </w:p>
+    <w:p>
+      <w:r>
+        <w:t>Chez blackbox</w:t>
+      </w:r>
+      <w:r>
+        <w:t xml:space="preserve"> tech Sàrl</w:t>
+      </w:r>
+      <w:r>
+        <w:rPr>
+          <w:rStyle w:val="Appeldenotedefin"/>
+        </w:rPr>
+        <w:endnoteReference w:id="1"/>
+      </w:r>
+      <w:r>
+        <w:t>,</w:t>
+      </w:r>
+      <w:r>
+        <w:t xml:space="preserve"> la société qui m’emploie,</w:t>
+      </w:r>
+      <w:r>
+        <w:t xml:space="preserve"> </w:t>
+      </w:r>
+      <w:r>
+        <w:t>nous accompagnons nos clients</w:t>
+      </w:r>
+      <w:r>
+        <w:t xml:space="preserve"> qui ont pour objectif</w:t>
+      </w:r>
+      <w:r>
+        <w:t xml:space="preserve"> de se digitaliser</w:t>
+      </w:r>
+      <w:r>
+        <w:t>.</w:t>
+      </w:r>
+    </w:p>
+    <w:p>
+      <w:r>
+        <w:t>La prise en charge d’un client commence toujours par une analyse</w:t>
+      </w:r>
+      <w:r>
+        <w:t xml:space="preserve"> approfondie</w:t>
+      </w:r>
+      <w:r>
+        <w:t xml:space="preserve"> </w:t>
+      </w:r>
+      <w:r>
+        <w:t>de toutes les interactions internes et externes</w:t>
+      </w:r>
+      <w:r>
+        <w:t xml:space="preserve"> de la société. Nous nous forçons d’apprendre et de comprendre le fonctionnement</w:t>
+      </w:r>
+      <w:r>
+        <w:t xml:space="preserve"> des différents processus</w:t>
+      </w:r>
+      <w:r>
+        <w:t xml:space="preserve"> </w:t>
+      </w:r>
+      <w:r>
+        <w:t>de la société autant au niveau administratif que de la production.</w:t>
+      </w:r>
+    </w:p>
+    <w:p>
+      <w:r>
+        <w:t>Notre approche est avant tout proactive</w:t>
+      </w:r>
+      <w:r>
+        <w:t xml:space="preserve"> et collaborative. Nous anticipons les besoins futurs qu’amènerons les améliorations et le client ainsi que ses collaborateurs restent toujours au centre de nos décisions. Ils sont consultés</w:t>
+      </w:r>
+      <w:r>
+        <w:t xml:space="preserve"> durant toute l’analyse</w:t>
+      </w:r>
+      <w:r>
+        <w:t xml:space="preserve"> afin que </w:t>
+      </w:r>
+      <w:r>
+        <w:t>l’</w:t>
+      </w:r>
+      <w:r>
+        <w:t>expérience de leur domaine nous soutienne dans</w:t>
+      </w:r>
+      <w:r>
+        <w:t xml:space="preserve"> la mise en place des</w:t>
+      </w:r>
+      <w:r>
+        <w:t xml:space="preserve"> processus</w:t>
+      </w:r>
+      <w:r>
+        <w:t xml:space="preserve"> créés sur mesure</w:t>
+      </w:r>
+      <w:r>
+        <w:t>.</w:t>
+      </w:r>
+    </w:p>
+    <w:p>
+      <w:pPr>
+        <w:pStyle w:val="Titre3"/>
+      </w:pPr>
+      <w:bookmarkStart w:id="9" w:name="_Toc229378728"/>
+      <w:r>
+        <w:t>Présentation Odoo</w:t>
+      </w:r>
+      <w:bookmarkEnd w:id="9"/>
+    </w:p>
+    <w:p>
+      <w:r>
+        <w:t>L'histoire d'Odoo</w:t>
+      </w:r>
+      <w:r>
+        <w:rPr>
+          <w:rStyle w:val="Appeldenotedefin"/>
+        </w:rPr>
+        <w:endnoteReference w:id="2"/>
+      </w:r>
+      <w:r>
+        <w:t xml:space="preserve"> commence en 2002 sous l'impulsion de Fabien Pinckaers qui, depuis sa chambre d'étudiant, lance </w:t>
+      </w:r>
+      <w:r>
+        <w:t xml:space="preserve">le logiciel </w:t>
+      </w:r>
+      <w:r>
+        <w:t xml:space="preserve">avec l'ambition de bousculer les géants du secteur. Aujourd'hui, en 2026, Odoo est devenu une véritable référence mondiale avec une valorisation dépassant les 8 milliards d'euros. L'écosystème s'est considérablement enrichi et propose désormais </w:t>
+      </w:r>
+      <w:r>
+        <w:t>près</w:t>
+      </w:r>
+      <w:r>
+        <w:t xml:space="preserve"> de 80 applications natives, complétées par des milliers de modules </w:t>
+      </w:r>
+      <w:r>
+        <w:t>open source.</w:t>
+      </w:r>
+    </w:p>
+    <w:p>
+      <w:r>
+        <w:t xml:space="preserve">Chez blackbox, nous sommes devenus partenaires et intégrateurs Odoo en fin 2025, peu de temps après que j’ai rejoint la société. </w:t>
+      </w:r>
+      <w:r>
+        <w:t xml:space="preserve">Malgré le fait que nous ne proposons pas Odoo en exclusivité, il </w:t>
+      </w:r>
+      <w:r>
+        <w:t xml:space="preserve">est un outil idéal pour nos clients en raison de sa modularité et de </w:t>
+      </w:r>
+      <w:r>
+        <w:t>son</w:t>
+      </w:r>
+      <w:r>
+        <w:t xml:space="preserve"> cout attractif.</w:t>
+      </w:r>
+      <w:r>
+        <w:t xml:space="preserve"> </w:t>
+      </w:r>
+    </w:p>
+    <w:p>
+      <w:pPr>
+        <w:pStyle w:val="Titre3"/>
+      </w:pPr>
+      <w:bookmarkStart w:id="10" w:name="_Toc229378729"/>
+      <w:r>
+        <w:t>Analyse du besoin</w:t>
+      </w:r>
+      <w:bookmarkEnd w:id="10"/>
+    </w:p>
+    <w:p>
+      <w:r>
+        <w:t>Le choix des applications que nous allons intégrer auprès des sociétés qui nous mandates est une tâche cruciale mais qui prend du temps aux employés de blackbox. J’ai vu dans cette étape une possibilité d’automatisation qui permettrai de non seulement gagner en efficacité mais également de standardiser notre offre.</w:t>
+      </w:r>
+      <w:r>
+        <w:t xml:space="preserve"> </w:t>
+      </w:r>
+    </w:p>
+    <w:p>
+      <w:r>
+        <w:t xml:space="preserve">L’éventail des applications dépends de divers </w:t>
+      </w:r>
+      <w:r>
+        <w:t>facteurs</w:t>
+      </w:r>
+      <w:r>
+        <w:t xml:space="preserve"> tel que la taille de la société, son secteur d’activité et son organisation.</w:t>
+      </w:r>
+    </w:p>
+    <w:p>
+      <w:r>
+        <w:t>Lors de la création d’une base de données Odoo, nous installons toutes les applications qui seront concernées afin de pouvoir les paramétrer. En raison des connexion possibles entres ces applications il est important pour l’implémentation que toutes les applications puissent travailler en concert même si l’utilisateur final les apprivoisera en plusieurs phases, les paramètres doivent être pensés à l’avance.</w:t>
+      </w:r>
+    </w:p>
+    <w:p>
+      <w:r>
+        <w:t>L’objectif de mon application est donc de faciliter la prise de décision lors de l’installation d’une nouvelle instance d’Odoo chez nos clients, d’accélérer notre préparation du logiciel afin de pouvoir le livrer le plus rapidement possible au client et éviter de devoir ajuster les paramètres des applications déjà en production.</w:t>
+      </w:r>
+      <w:r>
+        <w:br w:type="page"/>
+      </w:r>
+    </w:p>
+    <w:p>
+      <w:pPr>
         <w:pStyle w:val="Titre2"/>
       </w:pPr>
-      <w:bookmarkStart w:id="7" w:name="_Toc229378726"/>
-      <w:r>
-        <w:t>Présentation de l’application</w:t>
-      </w:r>
-      <w:bookmarkEnd w:id="7"/>
-    </w:p>
-    <w:p/>
+      <w:bookmarkStart w:id="11" w:name="_Toc229378730"/>
+      <w:r>
+        <w:lastRenderedPageBreak/>
+        <w:t xml:space="preserve">Création de la </w:t>
+      </w:r>
+      <w:proofErr w:type="spellStart"/>
+      <w:r>
+        <w:t>Database</w:t>
+      </w:r>
+      <w:bookmarkEnd w:id="11"/>
+      <w:proofErr w:type="spellEnd"/>
+    </w:p>
     <w:p>
       <w:pPr>
         <w:pStyle w:val="Titre3"/>
       </w:pPr>
-      <w:bookmarkStart w:id="8" w:name="_Toc229378727"/>
-      <w:r>
-        <w:t>Présentation blackbox</w:t>
-      </w:r>
-      <w:bookmarkEnd w:id="8"/>
-    </w:p>
-    <w:p>
-      <w:r>
-        <w:t>Chez blackbox</w:t>
-      </w:r>
-      <w:r>
-        <w:t xml:space="preserve"> tech Sàrl</w:t>
-      </w:r>
-      <w:r>
-        <w:t>,</w:t>
-      </w:r>
-      <w:r>
-        <w:t xml:space="preserve"> la société qui m’emploie,</w:t>
-      </w:r>
-      <w:r>
-        <w:t xml:space="preserve"> </w:t>
-      </w:r>
-      <w:r>
-        <w:t>nous accompagnons nos clients</w:t>
-      </w:r>
-      <w:r>
-        <w:t xml:space="preserve"> qui ont pour objectif</w:t>
-      </w:r>
-      <w:r>
-        <w:t xml:space="preserve"> de se digitaliser autant pour des raisons de concurrences que pour des raisons de coûts de gestion</w:t>
-      </w:r>
-      <w:r>
-        <w:t xml:space="preserve">. </w:t>
-      </w:r>
-      <w:r>
-        <w:t>Nous</w:t>
-      </w:r>
-      <w:r>
-        <w:t xml:space="preserve"> constat</w:t>
-      </w:r>
-      <w:r>
-        <w:t>ons</w:t>
-      </w:r>
-      <w:r>
-        <w:t xml:space="preserve"> souvent que les entreprises utilisent encore des outils inadaptés</w:t>
-      </w:r>
-      <w:r>
-        <w:t xml:space="preserve"> ou obsolètes</w:t>
-      </w:r>
-      <w:r>
-        <w:t xml:space="preserve"> qui freine leur processus internes.</w:t>
-      </w:r>
-    </w:p>
-    <w:p>
-      <w:r>
-        <w:t>La prise en charge d’un client commence toujours par une analyse</w:t>
-      </w:r>
-      <w:r>
-        <w:t xml:space="preserve"> approfondie</w:t>
-      </w:r>
-      <w:r>
-        <w:t xml:space="preserve"> </w:t>
-      </w:r>
-      <w:r>
-        <w:t>de toutes les interactions internes et externes</w:t>
-      </w:r>
-      <w:r>
-        <w:t xml:space="preserve"> de la société. Nous nous forçons d’apprendre et de comprendre le fonctionnement</w:t>
-      </w:r>
-      <w:r>
-        <w:t xml:space="preserve"> des différents processus</w:t>
-      </w:r>
-      <w:r>
-        <w:t xml:space="preserve"> </w:t>
-      </w:r>
-      <w:r>
-        <w:t>de la société autant au niveau administratif que de la production.</w:t>
-      </w:r>
-    </w:p>
-    <w:p>
-      <w:r>
-        <w:t>Notre approche est avant tout proactive</w:t>
-      </w:r>
-      <w:r>
-        <w:t xml:space="preserve"> et collaborative. Nous anticipons les besoins futurs qu’amènerons les améliorations et le client ainsi que ses collaborateurs restent toujours au centre de nos décisions. Ils sont consultés</w:t>
-      </w:r>
-      <w:r>
-        <w:t xml:space="preserve"> durant toute l’analyse</w:t>
-      </w:r>
-      <w:r>
-        <w:t xml:space="preserve"> afin que </w:t>
-      </w:r>
-      <w:r>
-        <w:t>l’</w:t>
-      </w:r>
-      <w:r>
-        <w:t>expérience de leur domaine nous soutienne dans</w:t>
-      </w:r>
-      <w:r>
-        <w:t xml:space="preserve"> la mise en place des</w:t>
-      </w:r>
-      <w:r>
-        <w:t xml:space="preserve"> processus</w:t>
-      </w:r>
-      <w:r>
-        <w:t xml:space="preserve"> créés sur mesure</w:t>
-      </w:r>
-      <w:r>
-        <w:t>.</w:t>
-      </w:r>
-    </w:p>
-    <w:p/>
-    <w:p>
-      <w:pPr>
-        <w:pStyle w:val="Titre3"/>
-      </w:pPr>
-      <w:bookmarkStart w:id="9" w:name="_Toc229378728"/>
-      <w:r>
-        <w:t>Présentation Odoo</w:t>
-      </w:r>
-      <w:bookmarkEnd w:id="9"/>
-    </w:p>
-    <w:p>
-      <w:r>
-        <w:t>L'histoire d'Odoo</w:t>
+      <w:bookmarkStart w:id="12" w:name="_Toc229378731"/>
+      <w:r>
+        <w:t>MCD – MLD</w:t>
+      </w:r>
+      <w:bookmarkEnd w:id="12"/>
+    </w:p>
+    <w:p>
+      <w:r>
+        <w:t>J’ai réalisé le diagramme</w:t>
+      </w:r>
+      <w:r>
+        <w:t xml:space="preserve"> MCD de ma base de </w:t>
+      </w:r>
+      <w:r>
+        <w:t>données</w:t>
+      </w:r>
+      <w:r>
+        <w:t xml:space="preserve"> sur l’application draw.io</w:t>
       </w:r>
       <w:r>
         <w:rPr>
           <w:rStyle w:val="Appeldenotedefin"/>
         </w:rPr>
-        <w:endnoteReference w:id="1"/>
-      </w:r>
-      <w:r>
-        <w:t xml:space="preserve"> commence en 2002 sous l'impulsion de Fabien Pinckaers qui, depuis sa chambre d'étudiant, lance TinyERP avec l'ambition de bousculer les géants du secteur. Le logiciel évolue une première fois en 2008 pour devenir OpenERP, marquant une phase de forte croissance grâce à son modèle open source. C'est en 2014 que la marque Odoo naît officiellement</w:t>
-      </w:r>
-      <w:r>
-        <w:t xml:space="preserve"> marquant un changement</w:t>
-      </w:r>
-      <w:r>
-        <w:t xml:space="preserve"> </w:t>
-      </w:r>
-      <w:r>
-        <w:t>complet de structure pour devenir un logiciel open core.</w:t>
-      </w:r>
-    </w:p>
-    <w:p>
-      <w:r>
-        <w:t xml:space="preserve">Aujourd'hui, en 2026, Odoo est devenu une véritable référence mondiale avec une valorisation dépassant les 8 milliards d'euros. L'écosystème s'est considérablement enrichi et propose désormais </w:t>
-      </w:r>
-      <w:r>
-        <w:t>près</w:t>
-      </w:r>
-      <w:r>
-        <w:t xml:space="preserve"> de 80 applications natives, complétées par des milliers de modules développés par une communauté internationale très active.</w:t>
-      </w:r>
-    </w:p>
-    <w:p>
-      <w:r>
-        <w:t xml:space="preserve">Chez blackbox, nous sommes devenus partenaires et intégrateurs Odoo en fin 2025, peu de temps après que j’ai rejoint la société. </w:t>
-      </w:r>
-      <w:r>
-        <w:t xml:space="preserve">Malgré le fait que nous ne proposons pas Odoo en exclusivité, il </w:t>
-      </w:r>
-      <w:r>
-        <w:t xml:space="preserve">est un outil idéal pour nos clients en raison de sa modularité et de </w:t>
-      </w:r>
-      <w:r>
-        <w:t>son</w:t>
-      </w:r>
-      <w:r>
-        <w:t xml:space="preserve"> cout attractif.</w:t>
-      </w:r>
-      <w:r>
-        <w:t xml:space="preserve"> Il est </w:t>
-      </w:r>
-      <w:r>
-        <w:t>suffisamment agi et personnalisable</w:t>
-      </w:r>
-      <w:r>
-        <w:t xml:space="preserve"> pour pouvoir s’adapter à des petites ou grande structure</w:t>
-      </w:r>
-      <w:r>
-        <w:t>. De plus</w:t>
-      </w:r>
-      <w:r>
-        <w:t>, les possibilités d’automatisations et de développement internes à l’application nous permettent de répondre avec exactitude à nos clients en leur proposant une solution sur mesure.</w:t>
-      </w:r>
-    </w:p>
-    <w:p>
-      <w:pPr>
-        <w:jc w:val="left"/>
-      </w:pPr>
-      <w:r>
-        <w:br w:type="page"/>
-      </w:r>
-    </w:p>
-    <w:p>
-      <w:pPr>
-        <w:pStyle w:val="Titre3"/>
-      </w:pPr>
-      <w:bookmarkStart w:id="10" w:name="_Toc229378729"/>
-      <w:r>
-        <w:lastRenderedPageBreak/>
-        <w:t>Analyse du besoin</w:t>
-      </w:r>
-      <w:bookmarkEnd w:id="10"/>
-    </w:p>
-    <w:p>
-      <w:r>
-        <w:t>Le choix des applications que nous allons intégrer auprès des sociétés qui nous mandates est une tâche cruciale mais qui prend du temps aux employés de blackbox. J’ai vu dans cette étape une possibilité d’automatisation qui permettrai de non seulement gagner en efficacité mais également de standardiser notre offre.</w:t>
-      </w:r>
-      <w:r>
-        <w:t xml:space="preserve"> </w:t>
-      </w:r>
-    </w:p>
-    <w:p>
-      <w:r>
-        <w:t xml:space="preserve">L’éventail des applications dépends de divers </w:t>
-      </w:r>
-      <w:r>
-        <w:t>facteurs</w:t>
-      </w:r>
-      <w:r>
-        <w:t xml:space="preserve"> tel que la taille de la société, son secteur d’activité et son organisation. Il faut également prendre en compte le fait que blackbox </w:t>
-      </w:r>
-      <w:r>
-        <w:t>implémente</w:t>
-      </w:r>
-      <w:r>
-        <w:t xml:space="preserve"> ces applications par phase afin de ne pas surcharger les utilisateurs finaux avec une formation lourde et leur évitant un changement trop radical qui pourrait freiner la prise en main du logiciel.</w:t>
-      </w:r>
-    </w:p>
-    <w:p>
-      <w:r>
-        <w:t>Lors de la création d’une base de données Odoo, nous installons toutes les applications qui seront concernées afin de pouvoir les paramétrer. En raison des connexion possibles entres ces applications il est important pour l’implémentation que toutes les applications puissent travailler en concert même si l’utilisateur final les apprivoisera en plusieurs phases, les paramètres doivent être pensés à l’avance.</w:t>
-      </w:r>
-    </w:p>
-    <w:p>
-      <w:r>
-        <w:t>L’objectif de mon application est donc de faciliter la prise de décision lors de l’installation d’une nouvelle instance d’Odoo chez nos clients, d’accélérer notre préparation du logiciel afin de pouvoir le livrer le plus rapidement possible au client et éviter de devoir ajuster les paramètres des applications déjà en production.</w:t>
-      </w:r>
-    </w:p>
-    <w:p/>
-    <w:p/>
-    <w:p/>
+        <w:endnoteReference w:id="3"/>
+      </w:r>
+    </w:p>
     <w:p>
       <w:pPr>
         <w:jc w:val="center"/>
@@ -2262,163 +2383,7 @@
           <w:noProof/>
         </w:rPr>
         <w:drawing>
-          <wp:inline distT="0" distB="0" distL="0" distR="0" wp14:anchorId="42F7EAD2" wp14:editId="441199A3">
-            <wp:extent cx="1440000" cy="1648889"/>
-            <wp:effectExtent l="0" t="0" r="8255" b="8890"/>
-            <wp:docPr id="1482388818" name="Image 2" descr="Blackbox Speak Digital&#10;&#10;Le contenu généré par l’IA peut être incorrect."/>
-            <wp:cNvGraphicFramePr>
-              <a:graphicFrameLocks xmlns:a="http://schemas.openxmlformats.org/drawingml/2006/main" noChangeAspect="1"/>
-            </wp:cNvGraphicFramePr>
-            <a:graphic xmlns:a="http://schemas.openxmlformats.org/drawingml/2006/main">
-              <a:graphicData uri="http://schemas.openxmlformats.org/drawingml/2006/picture">
-                <pic:pic xmlns:pic="http://schemas.openxmlformats.org/drawingml/2006/picture">
-                  <pic:nvPicPr>
-                    <pic:cNvPr id="1482388818" name="Image 2" descr="Blackbox Speak Digital&#10;&#10;Le contenu généré par l’IA peut être incorrect."/>
-                    <pic:cNvPicPr/>
-                  </pic:nvPicPr>
-                  <pic:blipFill>
-                    <a:blip r:embed="rId8" cstate="print">
-                      <a:extLst>
-                        <a:ext uri="{28A0092B-C50C-407E-A947-70E740481C1C}">
-                          <a14:useLocalDpi xmlns:a14="http://schemas.microsoft.com/office/drawing/2010/main" val="0"/>
-                        </a:ext>
-                      </a:extLst>
-                    </a:blip>
-                    <a:stretch>
-                      <a:fillRect/>
-                    </a:stretch>
-                  </pic:blipFill>
-                  <pic:spPr>
-                    <a:xfrm>
-                      <a:off x="0" y="0"/>
-                      <a:ext cx="1440000" cy="1648889"/>
-                    </a:xfrm>
-                    <a:prstGeom prst="rect">
-                      <a:avLst/>
-                    </a:prstGeom>
-                  </pic:spPr>
-                </pic:pic>
-              </a:graphicData>
-            </a:graphic>
-          </wp:inline>
-        </w:drawing>
-      </w:r>
-    </w:p>
-    <w:p>
-      <w:pPr>
-        <w:jc w:val="center"/>
-      </w:pPr>
-    </w:p>
-    <w:p>
-      <w:pPr>
-        <w:jc w:val="center"/>
-      </w:pPr>
-    </w:p>
-    <w:p>
-      <w:pPr>
-        <w:jc w:val="center"/>
-      </w:pPr>
-      <w:r>
-        <w:rPr>
-          <w:noProof/>
-        </w:rPr>
-        <w:drawing>
-          <wp:inline distT="0" distB="0" distL="0" distR="0" wp14:anchorId="6D174967" wp14:editId="1DCC5CD2">
-            <wp:extent cx="2880000" cy="930793"/>
-            <wp:effectExtent l="0" t="0" r="0" b="3175"/>
-            <wp:docPr id="729987482" name="Image 3" descr="ooo&#10;&#10;Le contenu généré par l’IA peut être incorrect."/>
-            <wp:cNvGraphicFramePr>
-              <a:graphicFrameLocks xmlns:a="http://schemas.openxmlformats.org/drawingml/2006/main" noChangeAspect="1"/>
-            </wp:cNvGraphicFramePr>
-            <a:graphic xmlns:a="http://schemas.openxmlformats.org/drawingml/2006/main">
-              <a:graphicData uri="http://schemas.openxmlformats.org/drawingml/2006/picture">
-                <pic:pic xmlns:pic="http://schemas.openxmlformats.org/drawingml/2006/picture">
-                  <pic:nvPicPr>
-                    <pic:cNvPr id="729987482" name="Image 3" descr="ooo&#10;&#10;Le contenu généré par l’IA peut être incorrect."/>
-                    <pic:cNvPicPr/>
-                  </pic:nvPicPr>
-                  <pic:blipFill>
-                    <a:blip r:embed="rId9" cstate="print">
-                      <a:extLst>
-                        <a:ext uri="{28A0092B-C50C-407E-A947-70E740481C1C}">
-                          <a14:useLocalDpi xmlns:a14="http://schemas.microsoft.com/office/drawing/2010/main" val="0"/>
-                        </a:ext>
-                      </a:extLst>
-                    </a:blip>
-                    <a:stretch>
-                      <a:fillRect/>
-                    </a:stretch>
-                  </pic:blipFill>
-                  <pic:spPr>
-                    <a:xfrm>
-                      <a:off x="0" y="0"/>
-                      <a:ext cx="2880000" cy="930793"/>
-                    </a:xfrm>
-                    <a:prstGeom prst="rect">
-                      <a:avLst/>
-                    </a:prstGeom>
-                  </pic:spPr>
-                </pic:pic>
-              </a:graphicData>
-            </a:graphic>
-          </wp:inline>
-        </w:drawing>
-      </w:r>
-      <w:r>
-        <w:br w:type="page"/>
-      </w:r>
-    </w:p>
-    <w:p>
-      <w:pPr>
-        <w:pStyle w:val="Titre2"/>
-      </w:pPr>
-      <w:bookmarkStart w:id="11" w:name="_Toc229378730"/>
-      <w:r>
-        <w:lastRenderedPageBreak/>
-        <w:t>Création de la Database</w:t>
-      </w:r>
-      <w:bookmarkEnd w:id="11"/>
-    </w:p>
-    <w:p>
-      <w:pPr>
-        <w:pStyle w:val="Titre3"/>
-      </w:pPr>
-      <w:bookmarkStart w:id="12" w:name="_Toc229378731"/>
-      <w:r>
-        <w:t>MCD – MLD</w:t>
-      </w:r>
-      <w:bookmarkEnd w:id="12"/>
-    </w:p>
-    <w:p>
-      <w:r>
-        <w:t>J’ai réalisé le diagramme</w:t>
-      </w:r>
-      <w:r>
-        <w:t xml:space="preserve"> MCD de ma base de </w:t>
-      </w:r>
-      <w:r>
-        <w:t>données</w:t>
-      </w:r>
-      <w:r>
-        <w:t xml:space="preserve"> sur l’application draw.io</w:t>
-      </w:r>
-      <w:r>
-        <w:rPr>
-          <w:rStyle w:val="Appeldenotedefin"/>
-        </w:rPr>
-        <w:endnoteReference w:id="2"/>
-      </w:r>
-    </w:p>
-    <w:p>
-      <w:pPr>
-        <w:jc w:val="center"/>
-      </w:pPr>
-      <w:r>
-        <w:rPr>
-          <w:noProof/>
-        </w:rPr>
-        <w:drawing>
-          <wp:inline distT="0" distB="0" distL="0" distR="0" wp14:anchorId="21E68C8E" wp14:editId="3868A43E">
+          <wp:inline distT="0" distB="0" distL="0" distR="0" wp14:anchorId="21E68C8E" wp14:editId="15F15FA2">
             <wp:extent cx="4320000" cy="3930953"/>
             <wp:effectExtent l="0" t="0" r="4445" b="0"/>
             <wp:docPr id="1174518231" name="Image 1" descr="The diagram is a UML (Unified Modeling Language) class diagram showing relationships among various entities such as Client, Resultat, ID, EMail, and others, with various attributes like Nom, DateGeneration, and others, and their associations depicted with lines and multiplicity notations.&#10;&#10;Le contenu généré par l’IA peut être incorrect."/>
@@ -2433,7 +2398,7 @@
                     <pic:cNvPicPr/>
                   </pic:nvPicPr>
                   <pic:blipFill>
-                    <a:blip r:embed="rId10"/>
+                    <a:blip r:embed="rId11"/>
                     <a:stretch>
                       <a:fillRect/>
                     </a:stretch>
@@ -2446,6 +2411,9 @@
                     <a:prstGeom prst="rect">
                       <a:avLst/>
                     </a:prstGeom>
+                    <a:effectLst>
+                      <a:softEdge rad="12700"/>
+                    </a:effectLst>
                   </pic:spPr>
                 </pic:pic>
               </a:graphicData>
@@ -2462,7 +2430,7 @@
         <w:rPr>
           <w:rStyle w:val="Appeldenotedefin"/>
         </w:rPr>
-        <w:endnoteReference w:id="3"/>
+        <w:endnoteReference w:id="4"/>
       </w:r>
     </w:p>
     <w:p>
@@ -2474,7 +2442,7 @@
           <w:noProof/>
         </w:rPr>
         <w:drawing>
-          <wp:inline distT="0" distB="0" distL="0" distR="0" wp14:anchorId="1565FF35" wp14:editId="2823ABB0">
+          <wp:inline distT="0" distB="0" distL="0" distR="0" wp14:anchorId="1565FF35" wp14:editId="77A1EB04">
             <wp:extent cx="4320000" cy="3607619"/>
             <wp:effectExtent l="0" t="0" r="4445" b="0"/>
             <wp:docPr id="501998415" name="Image 1" descr="The image illustrates a database schema with various fields and relationships, including entities such as 'Client', 'Resultat', and 'Question', along with their attributes like 'Id', 'Nom', and 'Description'.&#10;&#10;Le contenu généré par l’IA peut être incorrect."/>
@@ -2489,7 +2457,7 @@
                     <pic:cNvPicPr/>
                   </pic:nvPicPr>
                   <pic:blipFill>
-                    <a:blip r:embed="rId11"/>
+                    <a:blip r:embed="rId12"/>
                     <a:stretch>
                       <a:fillRect/>
                     </a:stretch>
@@ -2502,6 +2470,9 @@
                     <a:prstGeom prst="rect">
                       <a:avLst/>
                     </a:prstGeom>
+                    <a:effectLst>
+                      <a:softEdge rad="12700"/>
+                    </a:effectLst>
                   </pic:spPr>
                 </pic:pic>
               </a:graphicData>
@@ -2803,6 +2774,7 @@
                 <w:szCs w:val="16"/>
               </w:rPr>
             </w:pPr>
+            <w:proofErr w:type="spellStart"/>
             <w:r>
               <w:rPr>
                 <w:color w:val="1A1A1A"/>
@@ -2811,6 +2783,7 @@
               </w:rPr>
               <w:t>EMail</w:t>
             </w:r>
+            <w:proofErr w:type="spellEnd"/>
           </w:p>
         </w:tc>
         <w:tc>
@@ -2883,6 +2856,7 @@
                 <w:szCs w:val="16"/>
               </w:rPr>
             </w:pPr>
+            <w:proofErr w:type="spellStart"/>
             <w:r>
               <w:rPr>
                 <w:color w:val="1A1A1A"/>
@@ -2891,6 +2865,7 @@
               </w:rPr>
               <w:t>NombreEmploye</w:t>
             </w:r>
+            <w:proofErr w:type="spellEnd"/>
           </w:p>
         </w:tc>
         <w:tc>
@@ -2963,6 +2938,7 @@
                 <w:szCs w:val="16"/>
               </w:rPr>
             </w:pPr>
+            <w:proofErr w:type="spellStart"/>
             <w:r>
               <w:rPr>
                 <w:color w:val="1A1A1A"/>
@@ -2971,6 +2947,7 @@
               </w:rPr>
               <w:t>SecteurActiviteId</w:t>
             </w:r>
+            <w:proofErr w:type="spellEnd"/>
           </w:p>
         </w:tc>
         <w:tc>
@@ -3019,8 +2996,18 @@
                 <w:sz w:val="16"/>
                 <w:szCs w:val="16"/>
               </w:rPr>
-              <w:t>Référence vers SecteurActivite</w:t>
-            </w:r>
+              <w:t xml:space="preserve">Référence vers </w:t>
+            </w:r>
+            <w:proofErr w:type="spellStart"/>
+            <w:r>
+              <w:rPr>
+                <w:color w:val="1A1A1A"/>
+                <w:sz w:val="16"/>
+                <w:szCs w:val="16"/>
+              </w:rPr>
+              <w:t>SecteurActivite</w:t>
+            </w:r>
+            <w:proofErr w:type="spellEnd"/>
           </w:p>
         </w:tc>
       </w:tr>
@@ -3028,21 +3015,6 @@
     <w:p/>
     <w:p>
       <w:pPr>
-        <w:rPr>
-          <w:b/>
-          <w:bCs/>
-        </w:rPr>
-      </w:pPr>
-      <w:r>
-        <w:rPr>
-          <w:b/>
-          <w:bCs/>
-        </w:rPr>
-        <w:t>Décisions de conception</w:t>
-      </w:r>
-    </w:p>
-    <w:p>
-      <w:pPr>
         <w:spacing w:before="100" w:after="60"/>
         <w:rPr>
           <w:color w:val="1A1A1A"/>
@@ -3052,7 +3024,13 @@
         <w:rPr>
           <w:color w:val="1A1A1A"/>
         </w:rPr>
-        <w:t>Les données clients complètes (adresse, contacts, etc.) sont déjà stockées dans l'Odoo interne de blackbox. Seuls les attributs ayant une incidence sur la sélection des applications sont stockés ici. Le NombreEmploye est particulièrement important car il a une incidence directe sur la tarification de l'ERP Odoo et n’est pas stocké dans la base de données Odoo blackbox. L’adresse e-mail quand a elle servira dans une future liaison de mon application vers Odoo en tant que référence unique.</w:t>
+        <w:t>Les données clients complètes (adresse, contacts, etc.) sont déjà stockées dans l'Odoo interne de blackbox. Seuls les attributs ayant une incidence sur la sélection des applications sont stockés ici.</w:t>
+      </w:r>
+      <w:r>
+        <w:rPr>
+          <w:color w:val="1A1A1A"/>
+        </w:rPr>
+        <w:t xml:space="preserve"> L’adresse e-mail quand a elle servira dans le futur pour une connexion directe avec Odoo.</w:t>
       </w:r>
     </w:p>
     <w:p>
@@ -3130,13 +3108,20 @@
     </w:p>
     <w:p>
       <w:pPr>
+        <w:jc w:val="left"/>
+      </w:pPr>
+    </w:p>
+    <w:p>
+      <w:pPr>
         <w:pStyle w:val="Titre3"/>
       </w:pPr>
       <w:bookmarkStart w:id="14" w:name="_Toc229378733"/>
+      <w:proofErr w:type="spellStart"/>
       <w:r>
         <w:t>SecteurActivite</w:t>
       </w:r>
       <w:bookmarkEnd w:id="14"/>
+      <w:proofErr w:type="spellEnd"/>
     </w:p>
     <w:p>
       <w:pPr>
@@ -3389,7 +3374,25 @@
                 <w:sz w:val="16"/>
                 <w:szCs w:val="16"/>
               </w:rPr>
-              <w:t>Nom du secteur (ex: Restauration, Négoce, Service)</w:t>
+              <w:t>Nom du secteur (</w:t>
+            </w:r>
+            <w:proofErr w:type="gramStart"/>
+            <w:r>
+              <w:rPr>
+                <w:color w:val="1A1A1A"/>
+                <w:sz w:val="16"/>
+                <w:szCs w:val="16"/>
+              </w:rPr>
+              <w:t>ex:</w:t>
+            </w:r>
+            <w:proofErr w:type="gramEnd"/>
+            <w:r>
+              <w:rPr>
+                <w:color w:val="1A1A1A"/>
+                <w:sz w:val="16"/>
+                <w:szCs w:val="16"/>
+              </w:rPr>
+              <w:t xml:space="preserve"> Restauration, Négoce, Service)</w:t>
             </w:r>
           </w:p>
         </w:tc>
@@ -3475,21 +3478,6 @@
     <w:p/>
     <w:p>
       <w:pPr>
-        <w:rPr>
-          <w:b/>
-          <w:bCs/>
-        </w:rPr>
-      </w:pPr>
-      <w:r>
-        <w:rPr>
-          <w:b/>
-          <w:bCs/>
-        </w:rPr>
-        <w:t>Décisions de conception</w:t>
-      </w:r>
-    </w:p>
-    <w:p>
-      <w:pPr>
         <w:spacing w:before="100" w:after="60"/>
         <w:rPr>
           <w:color w:val="1A1A1A"/>
@@ -3499,7 +3487,7 @@
         <w:rPr>
           <w:color w:val="1A1A1A"/>
         </w:rPr>
-        <w:t>Nom et Description suffisent pour identifier et caractériser un secteur. L'objectif de cette table est de regrouper les applications et questions liées à un domaine métier. Par exemple, le secteur Négoce impliquera automatiquement les applications Vente, Achat et Inventaire.</w:t>
+        <w:t>L'objectif de cette table est de regrouper les applications et questions liées à un domaine métier. Par exemple, le secteur Négoce impliquera automatiquement les applications Vente, Achat et Inventaire.</w:t>
       </w:r>
     </w:p>
     <w:p>
@@ -3521,7 +3509,21 @@
         <w:rPr>
           <w:color w:val="1A1A1A"/>
         </w:rPr>
-        <w:t>Les secteurs choisis sont sensés couvrir tous les secteurs d’activité. En cas de secteur très spécifique, l’utilisateur choisira le secteur le plus proche tout en indiquant dans un champ une note (liée à la table Resultat)</w:t>
+        <w:t xml:space="preserve">Les secteurs choisis sont sensés couvrir tous les secteurs d’activité. En cas de secteur très spécifique, l’utilisateur choisira le secteur le plus proche tout en indiquant dans un champ une note (liée à la table </w:t>
+      </w:r>
+      <w:proofErr w:type="spellStart"/>
+      <w:r>
+        <w:rPr>
+          <w:color w:val="1A1A1A"/>
+        </w:rPr>
+        <w:t>Resultat</w:t>
+      </w:r>
+      <w:proofErr w:type="spellEnd"/>
+      <w:r>
+        <w:rPr>
+          <w:color w:val="1A1A1A"/>
+        </w:rPr>
+        <w:t>)</w:t>
       </w:r>
       <w:r>
         <w:rPr>
@@ -3890,14 +3892,16 @@
                 <w:szCs w:val="16"/>
               </w:rPr>
             </w:pPr>
-            <w:r>
-              <w:rPr>
-                <w:color w:val="1A1A1A"/>
-                <w:sz w:val="16"/>
-                <w:szCs w:val="16"/>
-              </w:rPr>
-              <w:t>SecteurActiviteId</w:t>
-            </w:r>
+            <w:proofErr w:type="spellStart"/>
+            <w:r>
+              <w:rPr>
+                <w:color w:val="1A1A1A"/>
+                <w:sz w:val="16"/>
+                <w:szCs w:val="16"/>
+              </w:rPr>
+              <w:t>QuestionId</w:t>
+            </w:r>
+            <w:proofErr w:type="spellEnd"/>
           </w:p>
         </w:tc>
         <w:tc>
@@ -3919,81 +3923,25 @@
                 <w:sz w:val="16"/>
                 <w:szCs w:val="16"/>
               </w:rPr>
-              <w:t>INT (FK)</w:t>
-            </w:r>
-          </w:p>
-        </w:tc>
-        <w:tc>
-          <w:tcPr>
-            <w:tcW w:w="4312" w:type="dxa"/>
-          </w:tcPr>
-          <w:p>
-            <w:pPr>
-              <w:spacing w:before="60"/>
-              <w:rPr>
-                <w:color w:val="1A1A1A"/>
-                <w:sz w:val="16"/>
-                <w:szCs w:val="16"/>
-              </w:rPr>
-            </w:pPr>
-            <w:r>
-              <w:rPr>
-                <w:color w:val="1A1A1A"/>
-                <w:sz w:val="16"/>
-                <w:szCs w:val="16"/>
-              </w:rPr>
-              <w:t>Référence vers SecteurActivite</w:t>
-            </w:r>
-          </w:p>
-        </w:tc>
-      </w:tr>
-      <w:tr>
-        <w:trPr>
-          <w:trHeight w:val="20"/>
-        </w:trPr>
-        <w:tc>
-          <w:tcPr>
-            <w:tcW w:w="1911" w:type="dxa"/>
-          </w:tcPr>
-          <w:p>
-            <w:pPr>
-              <w:spacing w:before="60"/>
-              <w:rPr>
-                <w:color w:val="1A1A1A"/>
-                <w:sz w:val="16"/>
-                <w:szCs w:val="16"/>
-              </w:rPr>
-            </w:pPr>
-            <w:r>
-              <w:rPr>
-                <w:color w:val="1A1A1A"/>
-                <w:sz w:val="16"/>
-                <w:szCs w:val="16"/>
-              </w:rPr>
-              <w:t>QuestionId</w:t>
-            </w:r>
-          </w:p>
-        </w:tc>
-        <w:tc>
-          <w:tcPr>
-            <w:tcW w:w="1796" w:type="dxa"/>
-          </w:tcPr>
-          <w:p>
-            <w:pPr>
-              <w:spacing w:before="60"/>
-              <w:rPr>
-                <w:color w:val="1A1A1A"/>
-                <w:sz w:val="16"/>
-                <w:szCs w:val="16"/>
-              </w:rPr>
-            </w:pPr>
-            <w:r>
-              <w:rPr>
-                <w:color w:val="1A1A1A"/>
-                <w:sz w:val="16"/>
-                <w:szCs w:val="16"/>
-              </w:rPr>
-              <w:t>INT (FK, nullable)</w:t>
+              <w:t xml:space="preserve">INT (FK, </w:t>
+            </w:r>
+            <w:proofErr w:type="spellStart"/>
+            <w:r>
+              <w:rPr>
+                <w:color w:val="1A1A1A"/>
+                <w:sz w:val="16"/>
+                <w:szCs w:val="16"/>
+              </w:rPr>
+              <w:t>nullable</w:t>
+            </w:r>
+            <w:proofErr w:type="spellEnd"/>
+            <w:r>
+              <w:rPr>
+                <w:color w:val="1A1A1A"/>
+                <w:sz w:val="16"/>
+                <w:szCs w:val="16"/>
+              </w:rPr>
+              <w:t>)</w:t>
             </w:r>
           </w:p>
         </w:tc>
@@ -4025,21 +3973,6 @@
     <w:p/>
     <w:p>
       <w:pPr>
-        <w:rPr>
-          <w:b/>
-          <w:bCs/>
-        </w:rPr>
-      </w:pPr>
-      <w:r>
-        <w:rPr>
-          <w:b/>
-          <w:bCs/>
-        </w:rPr>
-        <w:t>Décisions de conception</w:t>
-      </w:r>
-    </w:p>
-    <w:p>
-      <w:pPr>
         <w:spacing w:before="100" w:after="60"/>
         <w:rPr>
           <w:color w:val="1A1A1A"/>
@@ -4057,7 +3990,21 @@
         <w:rPr>
           <w:color w:val="1A1A1A"/>
         </w:rPr>
-        <w:t>L'Id ne garantit pas un ordre logique pour l'utilisateur, notamment si des questions sont ajoutées ou insérées ultérieurement entre deux questions existantes. L'attribut Ordre permet de définir une séquence indépendante de l'Id, facilitant la maintenance du questionnaire</w:t>
+        <w:t xml:space="preserve">L'attribut Ordre permet de définir une séquence indépendante de </w:t>
+      </w:r>
+      <w:proofErr w:type="spellStart"/>
+      <w:r>
+        <w:rPr>
+          <w:color w:val="1A1A1A"/>
+        </w:rPr>
+        <w:t>l'Id</w:t>
+      </w:r>
+      <w:proofErr w:type="spellEnd"/>
+      <w:r>
+        <w:rPr>
+          <w:color w:val="1A1A1A"/>
+        </w:rPr>
+        <w:t>, facilitant la maintenance du questionnaire</w:t>
       </w:r>
       <w:r>
         <w:rPr>
@@ -4079,41 +4026,55 @@
           <w:bCs/>
           <w:color w:val="1A1A1A"/>
         </w:rPr>
-        <w:t xml:space="preserve">Question &gt; QuestionId (FK nullable) : </w:t>
-      </w:r>
-      <w:r>
-        <w:rPr>
-          <w:color w:val="1A1A1A"/>
-        </w:rPr>
-        <w:t>Ce champ permet de créer un questionnaire conditionnel : une question peut avoir des questions découlant spécifiquement de celle-ci. Si la réponse à la question parente est Non, les questions enfants sont ignorées et sautées.</w:t>
-      </w:r>
-      <w:r>
-        <w:rPr>
-          <w:color w:val="1A1A1A"/>
-        </w:rPr>
-        <w:t xml:space="preserve"> (référence récursive)</w:t>
-      </w:r>
-    </w:p>
-    <w:p>
-      <w:pPr>
-        <w:spacing w:before="100" w:after="60"/>
-        <w:rPr>
-          <w:color w:val="1A1A1A"/>
-        </w:rPr>
-      </w:pPr>
+        <w:t xml:space="preserve">Question &gt; </w:t>
+      </w:r>
+      <w:proofErr w:type="spellStart"/>
       <w:r>
         <w:rPr>
           <w:b/>
           <w:bCs/>
           <w:color w:val="1A1A1A"/>
         </w:rPr>
-        <w:t xml:space="preserve">1 question = 1 secteur d'activité : </w:t>
-      </w:r>
-      <w:r>
-        <w:rPr>
+        <w:t>QuestionId</w:t>
+      </w:r>
+      <w:proofErr w:type="spellEnd"/>
+      <w:r>
+        <w:rPr>
+          <w:b/>
+          <w:bCs/>
           <w:color w:val="1A1A1A"/>
         </w:rPr>
-        <w:t>Les questions sont volontairement liées à un secteur spécifique pour dynamiser le questionnaire. Il n'est pas pertinent de poser des questions sur la gestion de stock à un client dont l'activité est purement de service. Cela améliore l'expérience utilisateur et la pertinence des résultats.</w:t>
+        <w:t xml:space="preserve"> (FK </w:t>
+      </w:r>
+      <w:proofErr w:type="spellStart"/>
+      <w:r>
+        <w:rPr>
+          <w:b/>
+          <w:bCs/>
+          <w:color w:val="1A1A1A"/>
+        </w:rPr>
+        <w:t>nullable</w:t>
+      </w:r>
+      <w:proofErr w:type="spellEnd"/>
+      <w:r>
+        <w:rPr>
+          <w:b/>
+          <w:bCs/>
+          <w:color w:val="1A1A1A"/>
+        </w:rPr>
+        <w:t xml:space="preserve">) : </w:t>
+      </w:r>
+      <w:r>
+        <w:rPr>
+          <w:color w:val="1A1A1A"/>
+        </w:rPr>
+        <w:t xml:space="preserve">Ce champ </w:t>
+      </w:r>
+      <w:r>
+        <w:rPr>
+          <w:color w:val="1A1A1A"/>
+        </w:rPr>
+        <w:t>est une référence récursive permettant de lier des questions enfant à des questions parents.</w:t>
       </w:r>
     </w:p>
     <w:p>
@@ -4129,10 +4090,12 @@
         <w:pStyle w:val="Titre3"/>
       </w:pPr>
       <w:bookmarkStart w:id="16" w:name="_Toc229378735"/>
+      <w:proofErr w:type="spellStart"/>
       <w:r>
         <w:t>ApplicationOdoo</w:t>
       </w:r>
       <w:bookmarkEnd w:id="16"/>
+      <w:proofErr w:type="spellEnd"/>
     </w:p>
     <w:p>
       <w:pPr>
@@ -4481,6 +4444,7 @@
                 <w:szCs w:val="16"/>
               </w:rPr>
             </w:pPr>
+            <w:proofErr w:type="spellStart"/>
             <w:r>
               <w:rPr>
                 <w:color w:val="1A1A1A"/>
@@ -4489,6 +4453,7 @@
               </w:rPr>
               <w:t>EstEssentiel</w:t>
             </w:r>
+            <w:proofErr w:type="spellEnd"/>
           </w:p>
         </w:tc>
         <w:tc>
@@ -4555,6 +4520,7 @@
                 <w:szCs w:val="16"/>
               </w:rPr>
             </w:pPr>
+            <w:proofErr w:type="spellStart"/>
             <w:r>
               <w:rPr>
                 <w:color w:val="1A1A1A"/>
@@ -4563,6 +4529,7 @@
               </w:rPr>
               <w:t>EstAdministrative</w:t>
             </w:r>
+            <w:proofErr w:type="spellEnd"/>
           </w:p>
         </w:tc>
         <w:tc>
@@ -4629,6 +4596,7 @@
                 <w:szCs w:val="16"/>
               </w:rPr>
             </w:pPr>
+            <w:proofErr w:type="spellStart"/>
             <w:r>
               <w:rPr>
                 <w:color w:val="1A1A1A"/>
@@ -4637,6 +4605,7 @@
               </w:rPr>
               <w:t>SecteurActiviteId</w:t>
             </w:r>
+            <w:proofErr w:type="spellEnd"/>
           </w:p>
         </w:tc>
         <w:tc>
@@ -4658,7 +4627,25 @@
                 <w:sz w:val="16"/>
                 <w:szCs w:val="16"/>
               </w:rPr>
-              <w:t>INT (FK, nullable)</w:t>
+              <w:t xml:space="preserve">INT (FK, </w:t>
+            </w:r>
+            <w:proofErr w:type="spellStart"/>
+            <w:r>
+              <w:rPr>
+                <w:color w:val="1A1A1A"/>
+                <w:sz w:val="16"/>
+                <w:szCs w:val="16"/>
+              </w:rPr>
+              <w:t>nullable</w:t>
+            </w:r>
+            <w:proofErr w:type="spellEnd"/>
+            <w:r>
+              <w:rPr>
+                <w:color w:val="1A1A1A"/>
+                <w:sz w:val="16"/>
+                <w:szCs w:val="16"/>
+              </w:rPr>
+              <w:t>)</w:t>
             </w:r>
           </w:p>
         </w:tc>
@@ -4690,101 +4677,199 @@
     <w:p/>
     <w:p>
       <w:pPr>
-        <w:rPr>
-          <w:b/>
-          <w:bCs/>
-        </w:rPr>
-      </w:pPr>
-      <w:r>
-        <w:rPr>
-          <w:b/>
-          <w:bCs/>
-        </w:rPr>
-        <w:t>Décisions de conception</w:t>
-      </w:r>
-    </w:p>
-    <w:p>
-      <w:pPr>
         <w:spacing w:before="100" w:after="60"/>
         <w:rPr>
           <w:color w:val="1A1A1A"/>
         </w:rPr>
       </w:pPr>
+      <w:proofErr w:type="spellStart"/>
       <w:r>
         <w:rPr>
           <w:b/>
           <w:bCs/>
           <w:color w:val="1A1A1A"/>
         </w:rPr>
-        <w:t xml:space="preserve">EstEssentiel (boolean) : </w:t>
-      </w:r>
-      <w:r>
-        <w:rPr>
-          <w:color w:val="1A1A1A"/>
-        </w:rPr>
-        <w:t>Certaines applications sont indispensables pour un secteur d'activité donné dès le démarrage. Ce booléen permet de distinguer les applications à installer en priorité des applications secondaires pouvant être ajoutées ultérieurement.</w:t>
-      </w:r>
-    </w:p>
-    <w:p>
-      <w:pPr>
-        <w:spacing w:before="100" w:after="60"/>
-        <w:rPr>
-          <w:color w:val="1A1A1A"/>
-        </w:rPr>
-      </w:pPr>
+        <w:t>EstEssentiel</w:t>
+      </w:r>
+      <w:proofErr w:type="spellEnd"/>
       <w:r>
         <w:rPr>
           <w:b/>
           <w:bCs/>
           <w:color w:val="1A1A1A"/>
         </w:rPr>
-        <w:t xml:space="preserve">EstAdministrative (boolean) : </w:t>
-      </w:r>
-      <w:r>
-        <w:rPr>
-          <w:color w:val="1A1A1A"/>
-        </w:rPr>
-        <w:t>Certaines applications sont présentes dans quasi toutes les implémentations Odoo car elles couvrent des besoins universels (Comptabilité, Contacts, RH).</w:t>
-      </w:r>
-    </w:p>
-    <w:p>
-      <w:pPr>
-        <w:spacing w:before="100" w:after="60"/>
-        <w:rPr>
-          <w:color w:val="1A1A1A"/>
-        </w:rPr>
-      </w:pPr>
+        <w:t xml:space="preserve"> (</w:t>
+      </w:r>
+      <w:proofErr w:type="spellStart"/>
       <w:r>
         <w:rPr>
           <w:b/>
           <w:bCs/>
           <w:color w:val="1A1A1A"/>
         </w:rPr>
-        <w:t xml:space="preserve">SecteurActiviteId nullable : </w:t>
-      </w:r>
-      <w:r>
-        <w:rPr>
+        <w:t>boolean</w:t>
+      </w:r>
+      <w:proofErr w:type="spellEnd"/>
+      <w:r>
+        <w:rPr>
+          <w:b/>
+          <w:bCs/>
           <w:color w:val="1A1A1A"/>
         </w:rPr>
+        <w:t xml:space="preserve">) : </w:t>
+      </w:r>
+      <w:r>
+        <w:rPr>
+          <w:color w:val="1A1A1A"/>
+        </w:rPr>
+        <w:t xml:space="preserve">Certaines applications sont </w:t>
+      </w:r>
+      <w:r>
+        <w:rPr>
+          <w:color w:val="1A1A1A"/>
+        </w:rPr>
+        <w:t>sauf exception toujours installées.</w:t>
+      </w:r>
+    </w:p>
+    <w:p>
+      <w:pPr>
+        <w:spacing w:before="100" w:after="60"/>
+        <w:rPr>
+          <w:color w:val="1A1A1A"/>
+        </w:rPr>
+      </w:pPr>
+      <w:proofErr w:type="spellStart"/>
+      <w:r>
+        <w:rPr>
+          <w:b/>
+          <w:bCs/>
+          <w:color w:val="1A1A1A"/>
+        </w:rPr>
+        <w:t>EstAdministrative</w:t>
+      </w:r>
+      <w:proofErr w:type="spellEnd"/>
+      <w:r>
+        <w:rPr>
+          <w:b/>
+          <w:bCs/>
+          <w:color w:val="1A1A1A"/>
+        </w:rPr>
+        <w:t xml:space="preserve"> (</w:t>
+      </w:r>
+      <w:proofErr w:type="spellStart"/>
+      <w:r>
+        <w:rPr>
+          <w:b/>
+          <w:bCs/>
+          <w:color w:val="1A1A1A"/>
+        </w:rPr>
+        <w:t>boolean</w:t>
+      </w:r>
+      <w:proofErr w:type="spellEnd"/>
+      <w:r>
+        <w:rPr>
+          <w:b/>
+          <w:bCs/>
+          <w:color w:val="1A1A1A"/>
+        </w:rPr>
+        <w:t xml:space="preserve">) : </w:t>
+      </w:r>
+      <w:r>
+        <w:rPr>
+          <w:color w:val="1A1A1A"/>
+        </w:rPr>
+        <w:t>Aide pour la gestion des droits d’accès à des applications sensibles.</w:t>
+      </w:r>
+    </w:p>
+    <w:p>
+      <w:pPr>
+        <w:spacing w:before="100" w:after="60"/>
+        <w:rPr>
+          <w:color w:val="1A1A1A"/>
+        </w:rPr>
+      </w:pPr>
+      <w:proofErr w:type="spellStart"/>
+      <w:r>
+        <w:rPr>
+          <w:b/>
+          <w:bCs/>
+          <w:color w:val="1A1A1A"/>
+        </w:rPr>
+        <w:t>SecteurActiviteId</w:t>
+      </w:r>
+      <w:proofErr w:type="spellEnd"/>
+      <w:r>
+        <w:rPr>
+          <w:b/>
+          <w:bCs/>
+          <w:color w:val="1A1A1A"/>
+        </w:rPr>
+        <w:t xml:space="preserve"> </w:t>
+      </w:r>
+      <w:proofErr w:type="spellStart"/>
+      <w:r>
+        <w:rPr>
+          <w:b/>
+          <w:bCs/>
+          <w:color w:val="1A1A1A"/>
+        </w:rPr>
+        <w:t>nullable</w:t>
+      </w:r>
+      <w:proofErr w:type="spellEnd"/>
+      <w:r>
+        <w:rPr>
+          <w:b/>
+          <w:bCs/>
+          <w:color w:val="1A1A1A"/>
+        </w:rPr>
+        <w:t xml:space="preserve"> : </w:t>
+      </w:r>
+      <w:r>
+        <w:rPr>
+          <w:color w:val="1A1A1A"/>
+        </w:rPr>
         <w:t>U</w:t>
       </w:r>
       <w:r>
         <w:rPr>
           <w:color w:val="1A1A1A"/>
         </w:rPr>
-        <w:t>ne valeur NULL signifie que l'application est générale et proposée à tous les secteurs ; un Id de SecteurActivite renseigné indique que l'application est spécifique au secteur référencé.</w:t>
-      </w:r>
+        <w:t xml:space="preserve">ne valeur NULL signifie que l'application est générale et proposée à tous les secteurs ; un Id de </w:t>
+      </w:r>
+      <w:proofErr w:type="spellStart"/>
+      <w:r>
+        <w:rPr>
+          <w:color w:val="1A1A1A"/>
+        </w:rPr>
+        <w:t>SecteurActivite</w:t>
+      </w:r>
+      <w:proofErr w:type="spellEnd"/>
+      <w:r>
+        <w:rPr>
+          <w:color w:val="1A1A1A"/>
+        </w:rPr>
+        <w:t xml:space="preserve"> renseigné indique que l'application est spécifique au secteur référencé.</w:t>
+      </w:r>
+    </w:p>
+    <w:p>
+      <w:pPr>
+        <w:spacing w:before="100" w:after="60"/>
+        <w:rPr>
+          <w:color w:val="1A1A1A"/>
+        </w:rPr>
+      </w:pPr>
     </w:p>
     <w:p>
       <w:pPr>
         <w:pStyle w:val="Titre3"/>
       </w:pPr>
       <w:bookmarkStart w:id="17" w:name="_Toc229378736"/>
-      <w:r>
-        <w:lastRenderedPageBreak/>
+      <w:proofErr w:type="spellStart"/>
+      <w:r>
         <w:t>Resultat</w:t>
       </w:r>
       <w:bookmarkEnd w:id="17"/>
+      <w:proofErr w:type="spellEnd"/>
     </w:p>
     <w:p>
       <w:pPr>
@@ -4797,7 +4882,21 @@
         <w:rPr>
           <w:color w:val="1A1A1A"/>
         </w:rPr>
-        <w:t>Représente le résultat généré pour un client suite au questionnaire.</w:t>
+        <w:t xml:space="preserve">Représente le résultat généré pour un client </w:t>
+      </w:r>
+      <w:proofErr w:type="gramStart"/>
+      <w:r>
+        <w:rPr>
+          <w:color w:val="1A1A1A"/>
+        </w:rPr>
+        <w:t>suite au</w:t>
+      </w:r>
+      <w:proofErr w:type="gramEnd"/>
+      <w:r>
+        <w:rPr>
+          <w:color w:val="1A1A1A"/>
+        </w:rPr>
+        <w:t xml:space="preserve"> questionnaire.</w:t>
       </w:r>
     </w:p>
     <w:tbl>
@@ -4982,6 +5081,7 @@
                 <w:szCs w:val="16"/>
               </w:rPr>
             </w:pPr>
+            <w:proofErr w:type="spellStart"/>
             <w:r>
               <w:rPr>
                 <w:color w:val="1A1A1A"/>
@@ -4990,6 +5090,7 @@
               </w:rPr>
               <w:t>DateGeneration</w:t>
             </w:r>
+            <w:proofErr w:type="spellEnd"/>
           </w:p>
         </w:tc>
         <w:tc>
@@ -5197,62 +5298,77 @@
     </w:p>
     <w:p>
       <w:pPr>
-        <w:rPr>
-          <w:b/>
-          <w:bCs/>
-        </w:rPr>
-      </w:pPr>
-      <w:r>
-        <w:rPr>
-          <w:b/>
-          <w:bCs/>
-        </w:rPr>
-        <w:t>Décisions de conception</w:t>
-      </w:r>
-    </w:p>
-    <w:p>
-      <w:pPr>
         <w:spacing w:before="100" w:after="60"/>
       </w:pPr>
+      <w:proofErr w:type="spellStart"/>
       <w:r>
         <w:rPr>
           <w:b/>
           <w:bCs/>
           <w:color w:val="1A1A1A"/>
         </w:rPr>
-        <w:t xml:space="preserve">DateGeneration : </w:t>
-      </w:r>
-      <w:r>
-        <w:rPr>
-          <w:color w:val="1A1A1A"/>
-        </w:rPr>
-        <w:t>Permet de garder une trace de la date à laquelle la sélection a été générée. Utile si le résultat est écrasé à la suite d'une mise à jour des besoins du client, pour pouvoir identifier la version courante.</w:t>
-      </w:r>
-    </w:p>
-    <w:p>
-      <w:pPr>
-        <w:spacing w:before="100" w:after="60"/>
-      </w:pPr>
+        <w:t>DateGeneration</w:t>
+      </w:r>
+      <w:proofErr w:type="spellEnd"/>
       <w:r>
         <w:rPr>
           <w:b/>
           <w:bCs/>
           <w:color w:val="1A1A1A"/>
         </w:rPr>
+        <w:t xml:space="preserve"> : </w:t>
+      </w:r>
+      <w:r>
+        <w:rPr>
+          <w:color w:val="1A1A1A"/>
+        </w:rPr>
+        <w:t xml:space="preserve">Permet de garder une trace de la date à laquelle la sélection a été générée. </w:t>
+      </w:r>
+    </w:p>
+    <w:p>
+      <w:pPr>
+        <w:spacing w:before="100" w:after="60"/>
+      </w:pPr>
+      <w:r>
+        <w:rPr>
+          <w:b/>
+          <w:bCs/>
+          <w:color w:val="1A1A1A"/>
+        </w:rPr>
         <w:t xml:space="preserve">Notes : </w:t>
       </w:r>
       <w:r>
         <w:rPr>
           <w:color w:val="1A1A1A"/>
         </w:rPr>
-        <w:t>Champ libre pour documenter les cas particuliers ou les ajustements manuels apportés à la liste générée automatiquement. Par exemple, si un collaborateur blackbox ajoute ou retire une application sur la base d'une discussion avec le client.</w:t>
-      </w:r>
-    </w:p>
-    <w:p>
-      <w:pPr>
+        <w:t xml:space="preserve">Champ libre pour documenter les cas particuliers ou les ajustements </w:t>
+      </w:r>
+      <w:r>
         <w:rPr>
           <w:color w:val="1A1A1A"/>
         </w:rPr>
+        <w:t>à faire</w:t>
+      </w:r>
+    </w:p>
+    <w:p>
+      <w:pPr>
+        <w:jc w:val="left"/>
+        <w:rPr>
+          <w:color w:val="1A1A1A"/>
+        </w:rPr>
+      </w:pPr>
+      <w:r>
+        <w:rPr>
+          <w:color w:val="1A1A1A"/>
+        </w:rPr>
+        <w:br w:type="page"/>
+      </w:r>
+    </w:p>
+    <w:p>
+      <w:pPr>
+        <w:rPr>
+          <w:color w:val="1A1A1A"/>
+        </w:rPr>
       </w:pPr>
     </w:p>
     <w:p>
@@ -5260,8 +5376,23 @@
         <w:pStyle w:val="Titre3"/>
       </w:pPr>
       <w:bookmarkStart w:id="18" w:name="_Toc229378737"/>
-      <w:r>
-        <w:t>Repondre (table de liaison n,n)</w:t>
+      <w:proofErr w:type="spellStart"/>
+      <w:r>
+        <w:t>Repondre</w:t>
+      </w:r>
+      <w:proofErr w:type="spellEnd"/>
+      <w:r>
+        <w:t xml:space="preserve"> (table de liaison </w:t>
+      </w:r>
+      <w:proofErr w:type="spellStart"/>
+      <w:proofErr w:type="gramStart"/>
+      <w:r>
+        <w:t>n,n</w:t>
+      </w:r>
+      <w:proofErr w:type="spellEnd"/>
+      <w:proofErr w:type="gramEnd"/>
+      <w:r>
+        <w:t>)</w:t>
       </w:r>
       <w:bookmarkEnd w:id="18"/>
     </w:p>
@@ -5538,6 +5669,7 @@
                 <w:szCs w:val="16"/>
               </w:rPr>
             </w:pPr>
+            <w:proofErr w:type="spellStart"/>
             <w:r>
               <w:rPr>
                 <w:color w:val="1A1A1A"/>
@@ -5546,6 +5678,7 @@
               </w:rPr>
               <w:t>QuestionId</w:t>
             </w:r>
+            <w:proofErr w:type="spellEnd"/>
           </w:p>
         </w:tc>
         <w:tc>
@@ -5612,6 +5745,7 @@
                 <w:szCs w:val="16"/>
               </w:rPr>
             </w:pPr>
+            <w:proofErr w:type="spellStart"/>
             <w:r>
               <w:rPr>
                 <w:color w:val="1A1A1A"/>
@@ -5620,6 +5754,7 @@
               </w:rPr>
               <w:t>Reponse</w:t>
             </w:r>
+            <w:proofErr w:type="spellEnd"/>
           </w:p>
         </w:tc>
         <w:tc>
@@ -5682,84 +5817,60 @@
     </w:p>
     <w:p>
       <w:pPr>
-        <w:spacing w:before="120" w:after="60"/>
-      </w:pPr>
-      <w:r>
-        <w:rPr>
-          <w:b/>
-          <w:bCs/>
+        <w:spacing w:before="100" w:after="60"/>
+      </w:pPr>
+    </w:p>
+    <w:p>
+      <w:pPr>
+        <w:pStyle w:val="Titre3"/>
+      </w:pPr>
+      <w:bookmarkStart w:id="19" w:name="_Toc229378738"/>
+      <w:proofErr w:type="spellStart"/>
+      <w:r>
+        <w:t>QuestionApplication</w:t>
+      </w:r>
+      <w:proofErr w:type="spellEnd"/>
+      <w:r>
+        <w:t xml:space="preserve"> (table de liaison </w:t>
+      </w:r>
+      <w:proofErr w:type="spellStart"/>
+      <w:proofErr w:type="gramStart"/>
+      <w:r>
+        <w:t>n,n</w:t>
+      </w:r>
+      <w:proofErr w:type="spellEnd"/>
+      <w:proofErr w:type="gramEnd"/>
+      <w:r>
+        <w:t>)</w:t>
+      </w:r>
+      <w:bookmarkEnd w:id="19"/>
+    </w:p>
+    <w:p>
+      <w:pPr>
+        <w:spacing w:before="60" w:after="100"/>
+        <w:rPr>
           <w:color w:val="1A1A1A"/>
         </w:rPr>
-        <w:t>Décisions de conception</w:t>
-      </w:r>
-    </w:p>
-    <w:p>
-      <w:pPr>
-        <w:spacing w:before="100" w:after="60"/>
-      </w:pPr>
-      <w:r>
-        <w:rPr>
-          <w:b/>
-          <w:bCs/>
+      </w:pPr>
+      <w:r>
+        <w:rPr>
           <w:color w:val="1A1A1A"/>
         </w:rPr>
-        <w:t xml:space="preserve">Pourquoi cette table existe : </w:t>
-      </w:r>
+        <w:t xml:space="preserve">Table de liaison entre Question et </w:t>
+      </w:r>
+      <w:proofErr w:type="spellStart"/>
       <w:r>
         <w:rPr>
           <w:color w:val="1A1A1A"/>
         </w:rPr>
-        <w:t>Chaque client possède ses propres réponses, indépendamment des autres.</w:t>
-      </w:r>
-    </w:p>
-    <w:p>
-      <w:pPr>
-        <w:spacing w:before="100" w:after="60"/>
-      </w:pPr>
-      <w:r>
-        <w:rPr>
-          <w:b/>
-          <w:bCs/>
+        <w:t>ApplicationOdoo</w:t>
+      </w:r>
+      <w:proofErr w:type="spellEnd"/>
+      <w:r>
+        <w:rPr>
           <w:color w:val="1A1A1A"/>
         </w:rPr>
-        <w:t xml:space="preserve">Consultation et modification par client : </w:t>
-      </w:r>
-      <w:r>
-        <w:rPr>
-          <w:color w:val="1A1A1A"/>
-        </w:rPr>
-        <w:t>Lorsque l’utilisateur ouvre un client existant et clique sur “Modifier questionnaire”, l’application interroge cette table avec le ClientId pour récupérer toutes les réponses précédentes et les afficher en surbrillance. L’utilisateur peut modifier une réponse, ce qui met à jour la ligne correspondante dans Repondre et recalcule la liste d’applications via CreationListe.</w:t>
-      </w:r>
-      <w:r>
-        <w:rPr>
-          <w:color w:val="1A1A1A"/>
-        </w:rPr>
-        <w:br w:type="page"/>
-      </w:r>
-    </w:p>
-    <w:p>
-      <w:pPr>
-        <w:pStyle w:val="Titre3"/>
-      </w:pPr>
-      <w:bookmarkStart w:id="19" w:name="_Toc229378738"/>
-      <w:r>
-        <w:lastRenderedPageBreak/>
-        <w:t>QuestionApplication (table de liaison n,n)</w:t>
-      </w:r>
-      <w:bookmarkEnd w:id="19"/>
-    </w:p>
-    <w:p>
-      <w:pPr>
-        <w:spacing w:before="60" w:after="100"/>
-        <w:rPr>
-          <w:color w:val="1A1A1A"/>
-        </w:rPr>
-      </w:pPr>
-      <w:r>
-        <w:rPr>
-          <w:color w:val="1A1A1A"/>
-        </w:rPr>
-        <w:t xml:space="preserve">Table de liaison entre Question et ApplicationOdoo. </w:t>
+        <w:t xml:space="preserve">. </w:t>
       </w:r>
       <w:r>
         <w:rPr>
@@ -5956,6 +6067,7 @@
                 <w:szCs w:val="16"/>
               </w:rPr>
             </w:pPr>
+            <w:proofErr w:type="spellStart"/>
             <w:r>
               <w:rPr>
                 <w:color w:val="1A1A1A"/>
@@ -5964,6 +6076,7 @@
               </w:rPr>
               <w:t>QuestionId</w:t>
             </w:r>
+            <w:proofErr w:type="spellEnd"/>
           </w:p>
         </w:tc>
         <w:tc>
@@ -6030,6 +6143,7 @@
                 <w:szCs w:val="16"/>
               </w:rPr>
             </w:pPr>
+            <w:proofErr w:type="spellStart"/>
             <w:r>
               <w:rPr>
                 <w:color w:val="1A1A1A"/>
@@ -6038,6 +6152,7 @@
               </w:rPr>
               <w:t>ApplicationOdooId</w:t>
             </w:r>
+            <w:proofErr w:type="spellEnd"/>
           </w:p>
         </w:tc>
         <w:tc>
@@ -6082,8 +6197,18 @@
                 <w:sz w:val="16"/>
                 <w:szCs w:val="16"/>
               </w:rPr>
-              <w:t>Référence vers ApplicationOdoo</w:t>
-            </w:r>
+              <w:t xml:space="preserve">Référence vers </w:t>
+            </w:r>
+            <w:proofErr w:type="spellStart"/>
+            <w:r>
+              <w:rPr>
+                <w:color w:val="1A1A1A"/>
+                <w:sz w:val="16"/>
+                <w:szCs w:val="16"/>
+              </w:rPr>
+              <w:t>ApplicationOdoo</w:t>
+            </w:r>
+            <w:proofErr w:type="spellEnd"/>
           </w:p>
         </w:tc>
       </w:tr>
@@ -6094,21 +6219,6 @@
           <w:color w:val="196B24" w:themeColor="accent3"/>
         </w:rPr>
       </w:pPr>
-    </w:p>
-    <w:p>
-      <w:pPr>
-        <w:rPr>
-          <w:b/>
-          <w:bCs/>
-        </w:rPr>
-      </w:pPr>
-      <w:r>
-        <w:rPr>
-          <w:b/>
-          <w:bCs/>
-        </w:rPr>
-        <w:t>Décisions de conception</w:t>
-      </w:r>
     </w:p>
     <w:p>
       <w:pPr>
@@ -6120,46 +6230,45 @@
           <w:bCs/>
           <w:color w:val="1A1A1A"/>
         </w:rPr>
-        <w:t>Pourquoi cette table existe :</w:t>
-      </w:r>
+        <w:t xml:space="preserve">Liaison Question → </w:t>
+      </w:r>
+      <w:proofErr w:type="spellStart"/>
       <w:r>
         <w:rPr>
           <w:b/>
           <w:bCs/>
           <w:color w:val="1A1A1A"/>
         </w:rPr>
-        <w:t xml:space="preserve"> </w:t>
-      </w:r>
-      <w:r>
-        <w:rPr>
-          <w:color w:val="1A1A1A"/>
-        </w:rPr>
-        <w:t>Cette table de liaison permet d'associer librement plusieurs applications à une question et plusieurs questions à une même application, sans redondance de données.</w:t>
-      </w:r>
-    </w:p>
-    <w:p>
-      <w:pPr>
-        <w:spacing w:before="100" w:after="60"/>
-      </w:pPr>
+        <w:t>ApplicationOdoo</w:t>
+      </w:r>
+      <w:proofErr w:type="spellEnd"/>
       <w:r>
         <w:rPr>
           <w:b/>
           <w:bCs/>
           <w:color w:val="1A1A1A"/>
         </w:rPr>
-        <w:t xml:space="preserve">Liaison Question → ApplicationOdoo : </w:t>
+        <w:t xml:space="preserve"> : </w:t>
       </w:r>
       <w:r>
         <w:rPr>
           <w:color w:val="1A1A1A"/>
         </w:rPr>
-        <w:t>La logique de recommandation est directe : si la réponse stockée dans la table Repondre pour ce client et cette question est True (Oui), toutes les applications liées via cette table sont ajoutées au résultat. Certaines applications sont interdépendantes — par exemple, activer la Vente suggère également la Comptabilité. Inversement</w:t>
-      </w:r>
+        <w:t xml:space="preserve">La logique de recommandation est directe : si la réponse stockée dans la table </w:t>
+      </w:r>
+      <w:proofErr w:type="spellStart"/>
       <w:r>
         <w:rPr>
           <w:color w:val="1A1A1A"/>
         </w:rPr>
-        <w:t>.</w:t>
+        <w:t>Repondre</w:t>
+      </w:r>
+      <w:proofErr w:type="spellEnd"/>
+      <w:r>
+        <w:rPr>
+          <w:color w:val="1A1A1A"/>
+        </w:rPr>
+        <w:t xml:space="preserve"> pour ce client et cette question est True (Oui), toutes les applications liées via cette table sont ajoutées au résultat.</w:t>
       </w:r>
     </w:p>
     <w:p>
@@ -6175,8 +6284,23 @@
         <w:pStyle w:val="Titre3"/>
       </w:pPr>
       <w:bookmarkStart w:id="20" w:name="_Toc229378739"/>
-      <w:r>
-        <w:t>CreationListe (table de liaison n,n)</w:t>
+      <w:proofErr w:type="spellStart"/>
+      <w:r>
+        <w:t>CreationListe</w:t>
+      </w:r>
+      <w:proofErr w:type="spellEnd"/>
+      <w:r>
+        <w:t xml:space="preserve"> (table de liaison </w:t>
+      </w:r>
+      <w:proofErr w:type="spellStart"/>
+      <w:proofErr w:type="gramStart"/>
+      <w:r>
+        <w:t>n,n</w:t>
+      </w:r>
+      <w:proofErr w:type="spellEnd"/>
+      <w:proofErr w:type="gramEnd"/>
+      <w:r>
+        <w:t>)</w:t>
       </w:r>
       <w:bookmarkEnd w:id="20"/>
     </w:p>
@@ -6188,7 +6312,35 @@
         <w:rPr>
           <w:color w:val="1A1A1A"/>
         </w:rPr>
-        <w:t>Table de liaison entre Resultat et ApplicationOdoo. Représente concrètement la liste des applications sélectionnées pour un résultat donné.</w:t>
+        <w:t xml:space="preserve">Table de liaison entre </w:t>
+      </w:r>
+      <w:proofErr w:type="spellStart"/>
+      <w:r>
+        <w:rPr>
+          <w:color w:val="1A1A1A"/>
+        </w:rPr>
+        <w:t>Resultat</w:t>
+      </w:r>
+      <w:proofErr w:type="spellEnd"/>
+      <w:r>
+        <w:rPr>
+          <w:color w:val="1A1A1A"/>
+        </w:rPr>
+        <w:t xml:space="preserve"> et </w:t>
+      </w:r>
+      <w:proofErr w:type="spellStart"/>
+      <w:r>
+        <w:rPr>
+          <w:color w:val="1A1A1A"/>
+        </w:rPr>
+        <w:t>ApplicationOdoo</w:t>
+      </w:r>
+      <w:proofErr w:type="spellEnd"/>
+      <w:r>
+        <w:rPr>
+          <w:color w:val="1A1A1A"/>
+        </w:rPr>
+        <w:t>. Représente concrètement la liste des applications sélectionnées pour un résultat donné.</w:t>
       </w:r>
     </w:p>
     <w:tbl>
@@ -6373,6 +6525,7 @@
                 <w:szCs w:val="16"/>
               </w:rPr>
             </w:pPr>
+            <w:proofErr w:type="spellStart"/>
             <w:r>
               <w:rPr>
                 <w:color w:val="1A1A1A"/>
@@ -6381,6 +6534,7 @@
               </w:rPr>
               <w:t>ResultatId</w:t>
             </w:r>
+            <w:proofErr w:type="spellEnd"/>
           </w:p>
         </w:tc>
         <w:tc>
@@ -6425,8 +6579,18 @@
                 <w:sz w:val="16"/>
                 <w:szCs w:val="16"/>
               </w:rPr>
-              <w:t>Référence vers Resultat</w:t>
-            </w:r>
+              <w:t xml:space="preserve">Référence vers </w:t>
+            </w:r>
+            <w:proofErr w:type="spellStart"/>
+            <w:r>
+              <w:rPr>
+                <w:color w:val="1A1A1A"/>
+                <w:sz w:val="16"/>
+                <w:szCs w:val="16"/>
+              </w:rPr>
+              <w:t>Resultat</w:t>
+            </w:r>
+            <w:proofErr w:type="spellEnd"/>
           </w:p>
         </w:tc>
       </w:tr>
@@ -6447,6 +6611,7 @@
                 <w:szCs w:val="16"/>
               </w:rPr>
             </w:pPr>
+            <w:proofErr w:type="spellStart"/>
             <w:r>
               <w:rPr>
                 <w:color w:val="1A1A1A"/>
@@ -6455,6 +6620,7 @@
               </w:rPr>
               <w:t>ApplicationOdooId</w:t>
             </w:r>
+            <w:proofErr w:type="spellEnd"/>
           </w:p>
         </w:tc>
         <w:tc>
@@ -6499,8 +6665,18 @@
                 <w:sz w:val="16"/>
                 <w:szCs w:val="16"/>
               </w:rPr>
-              <w:t>Référence vers ApplicationOdoo</w:t>
-            </w:r>
+              <w:t xml:space="preserve">Référence vers </w:t>
+            </w:r>
+            <w:proofErr w:type="spellStart"/>
+            <w:r>
+              <w:rPr>
+                <w:color w:val="1A1A1A"/>
+                <w:sz w:val="16"/>
+                <w:szCs w:val="16"/>
+              </w:rPr>
+              <w:t>ApplicationOdoo</w:t>
+            </w:r>
+            <w:proofErr w:type="spellEnd"/>
           </w:p>
         </w:tc>
       </w:tr>
@@ -6514,48 +6690,416 @@
     </w:p>
     <w:p>
       <w:pPr>
+        <w:spacing w:before="100" w:after="60"/>
+      </w:pPr>
+      <w:r>
+        <w:rPr>
+          <w:color w:val="1A1A1A"/>
+        </w:rPr>
+        <w:t xml:space="preserve">Un résultat contient plusieurs applications Odoo, et une même application peut apparaître dans plusieurs résultats. Cette relation </w:t>
+      </w:r>
+      <w:proofErr w:type="spellStart"/>
+      <w:proofErr w:type="gramStart"/>
+      <w:r>
+        <w:rPr>
+          <w:color w:val="1A1A1A"/>
+        </w:rPr>
+        <w:t>n,n</w:t>
+      </w:r>
+      <w:proofErr w:type="spellEnd"/>
+      <w:proofErr w:type="gramEnd"/>
+      <w:r>
+        <w:rPr>
+          <w:color w:val="1A1A1A"/>
+        </w:rPr>
+        <w:t xml:space="preserve"> est résolue par cette table de liaison, qui constitue le contenu réel de la liste générée pour le client.</w:t>
+      </w:r>
+    </w:p>
+    <w:p>
+      <w:pPr>
+        <w:rPr>
+          <w:color w:val="1A1A1A"/>
+        </w:rPr>
+      </w:pPr>
+      <w:r>
+        <w:rPr>
+          <w:color w:val="1A1A1A"/>
+        </w:rPr>
+        <w:br w:type="page"/>
+      </w:r>
+    </w:p>
+    <w:p>
+      <w:pPr>
+        <w:pStyle w:val="Titre3"/>
+      </w:pPr>
+      <w:bookmarkStart w:id="21" w:name="_Toc229378740"/>
+      <w:r>
+        <w:lastRenderedPageBreak/>
+        <w:t>Mise en place de la DB</w:t>
+      </w:r>
+      <w:bookmarkEnd w:id="21"/>
+    </w:p>
+    <w:p>
+      <w:pPr>
+        <w:spacing w:before="100" w:after="100"/>
+      </w:pPr>
+      <w:r>
+        <w:t>La base de données est stockée</w:t>
+      </w:r>
+      <w:r>
+        <w:t xml:space="preserve"> est hébergée</w:t>
+      </w:r>
+      <w:r>
+        <w:t xml:space="preserve"> sur un container Docker</w:t>
+      </w:r>
+      <w:r>
+        <w:rPr>
+          <w:rStyle w:val="Appeldenotedefin"/>
+        </w:rPr>
+        <w:endnoteReference w:id="5"/>
+      </w:r>
+      <w:r>
+        <w:t xml:space="preserve"> créé </w:t>
+      </w:r>
+      <w:r>
+        <w:t>à partir d’</w:t>
+      </w:r>
+      <w:r>
+        <w:t xml:space="preserve">une image </w:t>
+      </w:r>
+      <w:r>
+        <w:t>Microsoft SQL Server (MSSQL)</w:t>
+      </w:r>
+      <w:r>
+        <w:t xml:space="preserve">. </w:t>
+      </w:r>
+      <w:r>
+        <w:t>La connexion entre la base de données et le projet</w:t>
+      </w:r>
+      <w:r>
+        <w:t xml:space="preserve"> Visual studio 2026 </w:t>
+      </w:r>
+      <w:r>
+        <w:t>est assurée par le</w:t>
+      </w:r>
+      <w:r>
+        <w:t xml:space="preserve"> scaffolding</w:t>
+      </w:r>
+      <w:r>
+        <w:t xml:space="preserve"> d’</w:t>
+      </w:r>
+      <w:proofErr w:type="spellStart"/>
+      <w:r>
+        <w:t>Entity</w:t>
+      </w:r>
+      <w:proofErr w:type="spellEnd"/>
+      <w:r>
+        <w:t xml:space="preserve"> Framework Core qui génère automatiquement les classes C# correspondantes aux tables de la base de données</w:t>
+      </w:r>
+      <w:r>
+        <w:t>.</w:t>
+      </w:r>
+    </w:p>
+    <w:p>
+      <w:pPr>
+        <w:spacing w:before="100" w:after="100"/>
+      </w:pPr>
+      <w:r>
+        <w:t>Le script</w:t>
+      </w:r>
+      <w:r>
+        <w:t xml:space="preserve"> de la base de données en SQL a été générée directement via le concepteur DB designer qui permet d’importer </w:t>
+      </w:r>
+      <w:r>
+        <w:t>depuis la création graphique l</w:t>
+      </w:r>
+      <w:r>
+        <w:t>es tables et de leurs attributs.</w:t>
+      </w:r>
+    </w:p>
+    <w:p>
+      <w:r>
+        <w:t>Les clients fictifs ont été créé avec Claude AI</w:t>
+      </w:r>
+      <w:r>
+        <w:rPr>
+          <w:rStyle w:val="Appeldenotedefin"/>
+        </w:rPr>
+        <w:endnoteReference w:id="6"/>
+      </w:r>
+      <w:r>
+        <w:tab/>
+      </w:r>
+      <w:r>
+        <w:br/>
+      </w:r>
+    </w:p>
+    <w:p>
+      <w:pPr>
+        <w:pStyle w:val="Titre3"/>
+      </w:pPr>
+      <w:bookmarkStart w:id="22" w:name="_Toc229378741"/>
+      <w:r>
+        <w:t>Insertion des données initiales</w:t>
+      </w:r>
+      <w:bookmarkEnd w:id="22"/>
+    </w:p>
+    <w:p>
+      <w:pPr>
+        <w:spacing w:before="100" w:after="100"/>
+      </w:pPr>
+      <w:r>
+        <w:t>Une fois la structure en place, les données de référence ont été insérées via un script SQL généré depuis un fichier Excel</w:t>
+      </w:r>
+      <w:r>
+        <w:t xml:space="preserve"> créé par mes soins</w:t>
+      </w:r>
+      <w:r>
+        <w:t>. Le fichier ContenuDB.xlsx contenait 5 onglets correspondant aux tables à remplir :</w:t>
+      </w:r>
+    </w:p>
+    <w:p>
+      <w:pPr>
+        <w:pStyle w:val="Paragraphedeliste"/>
+        <w:numPr>
+          <w:ilvl w:val="0"/>
+          <w:numId w:val="11"/>
+        </w:numPr>
+        <w:spacing w:before="60" w:after="60" w:line="240" w:lineRule="auto"/>
+        <w:contextualSpacing w:val="0"/>
+        <w:jc w:val="left"/>
+      </w:pPr>
+      <w:proofErr w:type="spellStart"/>
+      <w:r>
+        <w:t>SecteurActivite</w:t>
+      </w:r>
+      <w:proofErr w:type="spellEnd"/>
+      <w:r>
+        <w:t xml:space="preserve"> — 26 secteurs d'activité</w:t>
+      </w:r>
+    </w:p>
+    <w:p>
+      <w:pPr>
+        <w:pStyle w:val="Paragraphedeliste"/>
+        <w:numPr>
+          <w:ilvl w:val="0"/>
+          <w:numId w:val="11"/>
+        </w:numPr>
+        <w:spacing w:before="60" w:after="60" w:line="240" w:lineRule="auto"/>
+        <w:contextualSpacing w:val="0"/>
+        <w:jc w:val="left"/>
+      </w:pPr>
+      <w:proofErr w:type="spellStart"/>
+      <w:r>
+        <w:t>ApplicationOdoo</w:t>
+      </w:r>
+      <w:proofErr w:type="spellEnd"/>
+      <w:r>
+        <w:t xml:space="preserve"> — 6</w:t>
+      </w:r>
+      <w:r>
+        <w:t>4</w:t>
+      </w:r>
+      <w:r>
+        <w:t xml:space="preserve"> applications Odoo disponibles</w:t>
+      </w:r>
+    </w:p>
+    <w:p>
+      <w:pPr>
+        <w:pStyle w:val="Paragraphedeliste"/>
+        <w:numPr>
+          <w:ilvl w:val="0"/>
+          <w:numId w:val="11"/>
+        </w:numPr>
+        <w:spacing w:before="60" w:after="60" w:line="240" w:lineRule="auto"/>
+        <w:contextualSpacing w:val="0"/>
+        <w:jc w:val="left"/>
+      </w:pPr>
+      <w:r>
+        <w:t>Client — 23 clients de démonstration</w:t>
+      </w:r>
+    </w:p>
+    <w:p>
+      <w:pPr>
+        <w:pStyle w:val="Paragraphedeliste"/>
+        <w:numPr>
+          <w:ilvl w:val="0"/>
+          <w:numId w:val="11"/>
+        </w:numPr>
+        <w:spacing w:before="60" w:after="60" w:line="240" w:lineRule="auto"/>
+        <w:contextualSpacing w:val="0"/>
+        <w:jc w:val="left"/>
+      </w:pPr>
+      <w:r>
+        <w:t xml:space="preserve">Questions — </w:t>
+      </w:r>
+      <w:r>
+        <w:t>6</w:t>
+      </w:r>
+      <w:r>
+        <w:t>4 questions du questionnaire dynamique</w:t>
+      </w:r>
+    </w:p>
+    <w:p>
+      <w:pPr>
+        <w:pStyle w:val="Paragraphedeliste"/>
+        <w:numPr>
+          <w:ilvl w:val="0"/>
+          <w:numId w:val="11"/>
+        </w:numPr>
+        <w:spacing w:before="60" w:after="60" w:line="240" w:lineRule="auto"/>
+        <w:contextualSpacing w:val="0"/>
+        <w:jc w:val="left"/>
+      </w:pPr>
+      <w:proofErr w:type="spellStart"/>
+      <w:r>
+        <w:t>CreationListe</w:t>
+      </w:r>
+      <w:proofErr w:type="spellEnd"/>
+      <w:r>
+        <w:t xml:space="preserve"> — </w:t>
+      </w:r>
+      <w:r>
+        <w:t>59</w:t>
+      </w:r>
+      <w:r>
+        <w:t xml:space="preserve"> liaisons question → application recommandée</w:t>
+      </w:r>
+    </w:p>
+    <w:p>
+      <w:pPr>
+        <w:spacing w:before="60" w:after="60" w:line="240" w:lineRule="auto"/>
+        <w:jc w:val="left"/>
+      </w:pPr>
+    </w:p>
+    <w:p>
+      <w:pPr>
+        <w:spacing w:before="60" w:after="60" w:line="240" w:lineRule="auto"/>
+        <w:jc w:val="left"/>
+      </w:pPr>
+      <w:r>
+        <w:t xml:space="preserve">Il existe des questions qui sont liées à aucune application. Ces questions sont des questions plus générales permettant de développer des questions enfant. Le </w:t>
+      </w:r>
+      <w:r>
+        <w:t>but</w:t>
+      </w:r>
+      <w:r>
+        <w:t xml:space="preserve"> est d’alléger l’expérience utilisateur en lui montrant seulement les applications </w:t>
+      </w:r>
+      <w:r>
+        <w:t>qui l’intéresse à un moment donné.</w:t>
+      </w:r>
+    </w:p>
+    <w:p>
+      <w:pPr>
+        <w:spacing w:before="60" w:after="60" w:line="240" w:lineRule="auto"/>
+        <w:jc w:val="left"/>
+      </w:pPr>
+    </w:p>
+    <w:p>
+      <w:r>
+        <w:t xml:space="preserve">Le </w:t>
+      </w:r>
+      <w:r>
+        <w:t>script SQL d’importation a été généré par Claude AI à partir du fichier Excel</w:t>
+      </w:r>
+    </w:p>
+    <w:p>
+      <w:pPr>
+        <w:jc w:val="left"/>
+      </w:pPr>
+      <w:r>
+        <w:br w:type="page"/>
+      </w:r>
+    </w:p>
+    <w:p>
+      <w:pPr>
+        <w:pStyle w:val="Titre2"/>
+      </w:pPr>
+      <w:bookmarkStart w:id="23" w:name="_Toc229378742"/>
+      <w:r>
+        <w:lastRenderedPageBreak/>
+        <w:t>Programmation</w:t>
+      </w:r>
+      <w:bookmarkEnd w:id="23"/>
+    </w:p>
+    <w:p>
+      <w:pPr>
+        <w:pStyle w:val="Titre3"/>
+      </w:pPr>
+      <w:r>
+        <w:t>Outils utilisés</w:t>
+      </w:r>
+    </w:p>
+    <w:p>
+      <w:r>
+        <w:t>L'application OdooScope a été développée avec les technologies suivantes :</w:t>
+      </w:r>
+    </w:p>
+    <w:p>
+      <w:r>
         <w:rPr>
           <w:b/>
           <w:bCs/>
         </w:rPr>
-      </w:pPr>
+        <w:t>Environnement de développement</w:t>
+      </w:r>
+      <w:r>
+        <w:t> Visual Studio 2022 a été utilisé comme environnement de développement intégré (IDE)</w:t>
+      </w:r>
+      <w:r>
+        <w:t>.</w:t>
+      </w:r>
+    </w:p>
+    <w:p>
       <w:r>
         <w:rPr>
           <w:b/>
           <w:bCs/>
         </w:rPr>
-        <w:t>Décisions de conception</w:t>
-      </w:r>
-    </w:p>
-    <w:p>
-      <w:pPr>
-        <w:spacing w:before="100" w:after="60"/>
-      </w:pPr>
+        <w:t xml:space="preserve">Langage et </w:t>
+      </w:r>
+      <w:proofErr w:type="spellStart"/>
       <w:r>
         <w:rPr>
           <w:b/>
           <w:bCs/>
-          <w:color w:val="1A1A1A"/>
-        </w:rPr>
-        <w:t xml:space="preserve">Pourquoi cette table existe : </w:t>
-      </w:r>
-      <w:r>
-        <w:rPr>
-          <w:color w:val="1A1A1A"/>
-        </w:rPr>
-        <w:t>Un résultat contient plusieurs applications Odoo, et une même application peut apparaître dans plusieurs résultats. Cette relation n,n est résolue par cette table de liaison, qui constitue le contenu réel de la liste générée pour le client.</w:t>
-      </w:r>
-    </w:p>
-    <w:p>
-      <w:pPr>
-        <w:rPr>
-          <w:color w:val="1A1A1A"/>
-        </w:rPr>
-      </w:pPr>
-      <w:r>
-        <w:rPr>
-          <w:color w:val="1A1A1A"/>
-        </w:rPr>
+        </w:rPr>
+        <w:t>framework</w:t>
+      </w:r>
+      <w:proofErr w:type="spellEnd"/>
+      <w:r>
+        <w:t xml:space="preserve"> L'application repose sur ASP.NET Core MVC en C#, un </w:t>
+      </w:r>
+      <w:proofErr w:type="spellStart"/>
+      <w:r>
+        <w:t>framework</w:t>
+      </w:r>
+      <w:proofErr w:type="spellEnd"/>
+      <w:r>
+        <w:t xml:space="preserve"> web de Microsoft permettant de structurer l'application selon le pattern Modèle-Vue-Contrôleur.</w:t>
+      </w:r>
+    </w:p>
+    <w:p>
+      <w:r>
+        <w:rPr>
+          <w:b/>
+          <w:bCs/>
+        </w:rPr>
+        <w:t>Frontend</w:t>
+      </w:r>
+      <w:r>
+        <w:t> L'interface utilisateur utilise Bootstrap pour la mise en page et le design responsive. La logique d'interactivité côté client est assurée par jQuery et jQuery Validation, notamment pour la gestion dynamique du questionnaire et la validation des formulaires. Les échanges asynchrones entre le navigateur et le serveur sont réalisés via AJAX.</w:t>
+      </w:r>
+      <w:r>
+        <w:t xml:space="preserve"> Des styles custom CSS ont également été utilisés lorsque je le jugeais nécessaire.</w:t>
+      </w:r>
+    </w:p>
+    <w:p>
+      <w:pPr>
+        <w:jc w:val="left"/>
+      </w:pPr>
+      <w:r>
         <w:br w:type="page"/>
       </w:r>
     </w:p>
@@ -6563,47 +7107,273 @@
       <w:pPr>
         <w:pStyle w:val="Titre3"/>
       </w:pPr>
-      <w:bookmarkStart w:id="21" w:name="_Toc229378740"/>
       <w:r>
         <w:lastRenderedPageBreak/>
-        <w:t>Mise en place de la DB</w:t>
-      </w:r>
-      <w:bookmarkEnd w:id="21"/>
-    </w:p>
-    <w:p>
-      <w:pPr>
-        <w:spacing w:before="100" w:after="100"/>
-      </w:pPr>
-      <w:r>
-        <w:t>La base de données est stockée sur un container Docker créé avec une image de mssql. Elle est liée à Visual studio 2026 via scaffolding. La création de la base de données en SQL a été générée directement via le concepteur DB designer qui permet d’importer le graphique en tant que script SQL permettant la création des tables et de leurs attributs.</w:t>
-      </w:r>
-    </w:p>
-    <w:p>
-      <w:pPr>
-        <w:spacing w:before="100" w:after="100"/>
-        <w:jc w:val="center"/>
-        <w:rPr>
-          <w:color w:val="D97757"/>
-        </w:rPr>
+        <w:t>Mode d’emplois</w:t>
+      </w:r>
+    </w:p>
+    <w:p>
+      <w:r>
+        <w:t xml:space="preserve">OdooScope s'utilise depuis le menu principal qui propose </w:t>
+      </w:r>
+      <w:r>
+        <w:t>cinq</w:t>
+      </w:r>
+      <w:r>
+        <w:t xml:space="preserve"> options.</w:t>
+      </w:r>
+      <w:r>
+        <w:t xml:space="preserve"> Une option pour la création d’un nouveau client, une pour la modification des client existant et trois pour la consultation des différents contenus de la base de données.</w:t>
+      </w:r>
+      <w:r>
+        <w:tab/>
+      </w:r>
+    </w:p>
+    <w:p>
+      <w:r>
+        <w:t>Le cycle </w:t>
+      </w:r>
+      <w:r>
+        <w:rPr>
+          <w:b/>
+          <w:bCs/>
+        </w:rPr>
+        <w:t>Nouveau Client </w:t>
+      </w:r>
+      <w:r>
+        <w:rPr>
+          <w:b/>
+          <w:bCs/>
+        </w:rPr>
+        <w:t>:</w:t>
+      </w:r>
+      <w:r>
+        <w:tab/>
+      </w:r>
+      <w:r>
+        <w:br/>
+        <w:t xml:space="preserve">L’utilisateur est amené sur un formulaire lui permettant de remplir les données principales du client et par ce fait créer un nouveau client dans la base de </w:t>
+      </w:r>
+      <w:r>
+        <w:t>données</w:t>
+      </w:r>
+      <w:r>
+        <w:t>. Une fois sauvegardé, il est conduit directement sur le questionnaire dynamique.</w:t>
+      </w:r>
+    </w:p>
+    <w:p>
+      <w:r>
+        <w:t xml:space="preserve">Il doit alors remplir le questionnaire avec des réponses fermées. </w:t>
+      </w:r>
+      <w:r>
+        <w:t>Nombreuses questions ont des questions enfants qui sont rendue invisible tant que la réponse de la question parent n’est pas positive cela dans un but d’alléger le questionnaire lors de sa complétion. Une fois toutes les questions renseignées, l’utilisateur clique sur le bouton suivant.</w:t>
+      </w:r>
+    </w:p>
+    <w:p>
+      <w:r>
+        <w:t>Avant d’arriver sur la page de résultat, les réponses sont traitées par le programme afin de générer une liste d’application. Cette liste sera composée d’application essentielles qui sont toujours proposées dans la liste car toujours installées dans un environnement Odoo, des applications liées spécifiquement au secteur d’activité du client et les applications liées au questionnaire. Une fois cette étape fait on affiche le résultat pour l’utilisateur.</w:t>
+      </w:r>
+    </w:p>
+    <w:p>
+      <w:r>
+        <w:t>Dans cette page résultat, on y trouve les informations du client, la liste des applications Odoo qui devront être installés sur l’environnement du client et les notes prises par l’utilisateur. Les notes apparaissent depuis la création du client en passant par le questionnaire jusqu’au résultat. Elles restent durant tout le processus éditable. Un bouton spécifique à l’enregistrement d’une édition de note est disponible sur la page résultat.</w:t>
+      </w:r>
+    </w:p>
+    <w:p>
+      <w:r>
+        <w:t>L</w:t>
+      </w:r>
+      <w:r>
+        <w:t xml:space="preserve">'utilisateur remplit un formulaire avec le nom, l'e-mail, le nombre d'employés et le secteur d'activité, puis répond au questionnaire dynamique en cliquant Oui ou Non sur chaque question. </w:t>
+      </w:r>
+    </w:p>
+    <w:p>
+      <w:r>
+        <w:t xml:space="preserve">Le cycle </w:t>
+      </w:r>
+      <w:r>
+        <w:rPr>
+          <w:b/>
+          <w:bCs/>
+        </w:rPr>
+        <w:t>Client Existant :</w:t>
+      </w:r>
+      <w:r>
+        <w:rPr>
+          <w:b/>
+          <w:bCs/>
+        </w:rPr>
+        <w:tab/>
+      </w:r>
+      <w:r>
+        <w:rPr>
+          <w:b/>
+          <w:bCs/>
+        </w:rPr>
+        <w:br/>
+      </w:r>
+      <w:r>
+        <w:t>La liste des clients existants en base de données est présentée à l’</w:t>
+      </w:r>
+      <w:r>
+        <w:t>utilisateur</w:t>
+      </w:r>
+      <w:r>
+        <w:t>. Sur chaque ligne, 3 boutons sont disponibles.</w:t>
+      </w:r>
+    </w:p>
+    <w:p>
+      <w:pPr>
+        <w:pStyle w:val="Paragraphedeliste"/>
+        <w:numPr>
+          <w:ilvl w:val="0"/>
+          <w:numId w:val="12"/>
+        </w:numPr>
+      </w:pPr>
+      <w:r>
+        <w:t>Client – Qui permet d’afficher le formulaire du client tel que remplis dans la base de données et laisse la possibilité à l’utilisateur de modifier les différents champs puis d’enregistrer les modifications.</w:t>
+      </w:r>
+    </w:p>
+    <w:p>
+      <w:pPr>
+        <w:pStyle w:val="Paragraphedeliste"/>
+        <w:numPr>
+          <w:ilvl w:val="0"/>
+          <w:numId w:val="12"/>
+        </w:numPr>
+      </w:pPr>
+      <w:r>
+        <w:t>Questions – Affiche le questionnaire tel qu’il a été remplis lors de la création ou la dernière modification des réponses puis peut être enregistrer.</w:t>
+      </w:r>
+    </w:p>
+    <w:p>
+      <w:pPr>
+        <w:pStyle w:val="Paragraphedeliste"/>
+        <w:numPr>
+          <w:ilvl w:val="0"/>
+          <w:numId w:val="12"/>
+        </w:numPr>
+      </w:pPr>
+      <w:r>
+        <w:t>Résultat – Permet à l’utilisateur de consulter le résultat obtenu pour le client sélectionné en therme d’application Odoo et de notes</w:t>
+      </w:r>
+    </w:p>
+    <w:p>
+      <w:pPr>
+        <w:ind w:left="360"/>
+      </w:pPr>
+      <w:r>
+        <w:t>Les notes restent éditables durant tous les processus du cycle Client Existant</w:t>
+      </w:r>
+    </w:p>
+    <w:p>
+      <w:pPr>
+        <w:jc w:val="left"/>
+      </w:pPr>
+      <w:r>
+        <w:br w:type="page"/>
+      </w:r>
+    </w:p>
+    <w:p>
+      <w:r>
+        <w:rPr>
+          <w:b/>
+          <w:bCs/>
+        </w:rPr>
+        <w:lastRenderedPageBreak/>
+        <w:t>Questionnaire, Secteurs d’activité, Application Odoo :</w:t>
+      </w:r>
+      <w:r>
+        <w:rPr>
+          <w:b/>
+          <w:bCs/>
+        </w:rPr>
+        <w:tab/>
+      </w:r>
+      <w:r>
+        <w:rPr>
+          <w:b/>
+          <w:bCs/>
+        </w:rPr>
+        <w:br/>
+      </w:r>
+      <w:r>
+        <w:t>Les 3 derniers boutons de l’écran principale permette à l’utilisateur de pouvoir consulter le contenu de la base de données dans ces trois points.</w:t>
+      </w:r>
+    </w:p>
+    <w:p>
+      <w:pPr>
+        <w:pStyle w:val="Paragraphedeliste"/>
+        <w:numPr>
+          <w:ilvl w:val="0"/>
+          <w:numId w:val="13"/>
+        </w:numPr>
+      </w:pPr>
+      <w:r>
+        <w:t>Questionnaire – Afficher la liste de toutes les questions, l’ordre d’apparition dans la liste, les références parents de chaque question, le secteur d’activité qui lui est propre.</w:t>
+      </w:r>
+    </w:p>
+    <w:p>
+      <w:pPr>
+        <w:pStyle w:val="Paragraphedeliste"/>
+        <w:numPr>
+          <w:ilvl w:val="0"/>
+          <w:numId w:val="13"/>
+        </w:numPr>
+      </w:pPr>
+      <w:r>
+        <w:t>Secteurs d’activité – Affiche la liste des secteurs d’activité avec leur description.</w:t>
+      </w:r>
+    </w:p>
+    <w:p>
+      <w:pPr>
+        <w:pStyle w:val="Paragraphedeliste"/>
+        <w:numPr>
+          <w:ilvl w:val="0"/>
+          <w:numId w:val="13"/>
+        </w:numPr>
+      </w:pPr>
+      <w:r>
+        <w:t>Application Odoo – Affiche la liste de t</w:t>
+      </w:r>
+      <w:r>
+        <w:t>outes les applications Odoo ainsi que leur description</w:t>
+      </w:r>
+    </w:p>
+    <w:p/>
+    <w:p>
+      <w:pPr>
+        <w:pStyle w:val="Titre3"/>
+      </w:pPr>
+      <w:r>
+        <w:t>Graphique fonctionnel</w:t>
+      </w:r>
+      <w:r>
+        <w:t xml:space="preserve"> de l’application</w:t>
+      </w:r>
+    </w:p>
+    <w:p/>
+    <w:p>
+      <w:pPr>
+        <w:jc w:val="left"/>
       </w:pPr>
       <w:r>
         <w:rPr>
           <w:noProof/>
-          <w:color w:val="EE0000"/>
         </w:rPr>
         <w:drawing>
-          <wp:anchor distT="0" distB="0" distL="114300" distR="114300" simplePos="0" relativeHeight="251661312" behindDoc="1" locked="0" layoutInCell="1" allowOverlap="1" wp14:anchorId="48CF173E" wp14:editId="1F162342">
+          <wp:anchor distT="0" distB="0" distL="114300" distR="114300" simplePos="0" relativeHeight="251665408" behindDoc="0" locked="0" layoutInCell="1" allowOverlap="1" wp14:anchorId="5D82ABC5" wp14:editId="72A7208C">
             <wp:simplePos x="0" y="0"/>
-            <wp:positionH relativeFrom="column">
-              <wp:posOffset>1193282</wp:posOffset>
+            <wp:positionH relativeFrom="margin">
+              <wp:posOffset>321945</wp:posOffset>
             </wp:positionH>
-            <wp:positionV relativeFrom="paragraph">
-              <wp:posOffset>-22988</wp:posOffset>
+            <wp:positionV relativeFrom="margin">
+              <wp:posOffset>2219325</wp:posOffset>
             </wp:positionV>
-            <wp:extent cx="251460" cy="251460"/>
+            <wp:extent cx="4781550" cy="6333490"/>
             <wp:effectExtent l="0" t="0" r="0" b="0"/>
-            <wp:wrapNone/>
-            <wp:docPr id="684825524" name="Image 1" descr="The image depicts a vibrant, solid orange star shape.&#10;&#10;Le contenu généré par l’IA peut être incorrect."/>
+            <wp:wrapSquare wrapText="bothSides"/>
+            <wp:docPr id="1537004199" name="Image 2" descr="The image is a diagram depicting a user interface with various categories such as 'Nouveau Client,' 'Secteur d'Activite,' and 'Questions,' with multiple options and actions like 'Applications Odoo,' 'Client Existant,' and 'Nombre Employe,' connected through a flowchart-like structure.&#10;&#10;Le contenu généré par l’IA peut être incorrect."/>
             <wp:cNvGraphicFramePr>
               <a:graphicFrameLocks xmlns:a="http://schemas.openxmlformats.org/drawingml/2006/main" noChangeAspect="1"/>
             </wp:cNvGraphicFramePr>
@@ -6611,13 +7381,13 @@
               <a:graphicData uri="http://schemas.openxmlformats.org/drawingml/2006/picture">
                 <pic:pic xmlns:pic="http://schemas.openxmlformats.org/drawingml/2006/picture">
                   <pic:nvPicPr>
-                    <pic:cNvPr id="684825524" name="Image 1" descr="The image depicts a vibrant, solid orange star shape.&#10;&#10;Le contenu généré par l’IA peut être incorrect."/>
+                    <pic:cNvPr id="1537004199" name="Image 2" descr="The image is a diagram depicting a user interface with various categories such as 'Nouveau Client,' 'Secteur d'Activite,' and 'Questions,' with multiple options and actions like 'Applications Odoo,' 'Client Existant,' and 'Nombre Employe,' connected through a flowchart-like structure.&#10;&#10;Le contenu généré par l’IA peut être incorrect."/>
                     <pic:cNvPicPr>
                       <a:picLocks noChangeAspect="1" noChangeArrowheads="1"/>
                     </pic:cNvPicPr>
                   </pic:nvPicPr>
                   <pic:blipFill>
-                    <a:blip r:embed="rId12">
+                    <a:blip r:embed="rId13">
                       <a:extLst>
                         <a:ext uri="{28A0092B-C50C-407E-A947-70E740481C1C}">
                           <a14:useLocalDpi xmlns:a14="http://schemas.microsoft.com/office/drawing/2010/main" val="0"/>
@@ -6632,7 +7402,7 @@
                   <pic:spPr bwMode="auto">
                     <a:xfrm>
                       <a:off x="0" y="0"/>
-                      <a:ext cx="251460" cy="251460"/>
+                      <a:ext cx="4781550" cy="6333490"/>
                     </a:xfrm>
                     <a:prstGeom prst="rect">
                       <a:avLst/>
@@ -6641,6 +7411,9 @@
                     <a:ln>
                       <a:noFill/>
                     </a:ln>
+                    <a:effectLst>
+                      <a:softEdge rad="12700"/>
+                    </a:effectLst>
                   </pic:spPr>
                 </pic:pic>
               </a:graphicData>
@@ -6655,34 +7428,31 @@
         </w:drawing>
       </w:r>
       <w:r>
-        <w:rPr>
-          <w:color w:val="D97757"/>
-        </w:rPr>
-        <w:t>Les clients fictifs ont été créé avec Claude AI</w:t>
-      </w:r>
-      <w:r>
-        <w:rPr>
-          <w:color w:val="D97757"/>
-        </w:rPr>
-        <w:br/>
-      </w:r>
+        <w:br w:type="page"/>
+      </w:r>
+    </w:p>
+    <w:p/>
+    <w:p>
+      <w:pPr>
+        <w:pStyle w:val="Titre2"/>
+      </w:pPr>
+      <w:bookmarkStart w:id="24" w:name="_Toc229378748"/>
+      <w:r>
+        <w:t>Evolutions futures</w:t>
+      </w:r>
+      <w:bookmarkEnd w:id="24"/>
     </w:p>
     <w:p>
       <w:pPr>
         <w:pStyle w:val="Titre3"/>
       </w:pPr>
-      <w:bookmarkStart w:id="22" w:name="_Toc229378741"/>
-      <w:r>
-        <w:t>Insertion des données initiales</w:t>
-      </w:r>
-      <w:bookmarkEnd w:id="22"/>
-    </w:p>
-    <w:p>
-      <w:pPr>
-        <w:spacing w:before="100" w:after="100"/>
-      </w:pPr>
-      <w:r>
-        <w:t>Une fois la structure en place, les données de référence (secteurs d'activité, applications Odoo, clients de test, questions et liaisons) ont été insérées via un script SQL généré depuis un fichier Excel. Le fichier ContenuDB.xlsx contenait 5 onglets correspondant aux tables à remplir :</w:t>
+      <w:r>
+        <w:t>Court terme</w:t>
+      </w:r>
+    </w:p>
+    <w:p>
+      <w:r>
+        <w:t>A court terme, j’aimerais apporter quelques modifications logiques à mon code.</w:t>
       </w:r>
     </w:p>
     <w:p>
@@ -6690,14 +7460,11 @@
         <w:pStyle w:val="Paragraphedeliste"/>
         <w:numPr>
           <w:ilvl w:val="0"/>
-          <w:numId w:val="11"/>
+          <w:numId w:val="14"/>
         </w:numPr>
-        <w:spacing w:before="60" w:after="60" w:line="240" w:lineRule="auto"/>
-        <w:contextualSpacing w:val="0"/>
-        <w:jc w:val="left"/>
-      </w:pPr>
-      <w:r>
-        <w:t>SecteurActivite — 26 secteurs d'activité</w:t>
+      </w:pPr>
+      <w:r>
+        <w:t>Possibilité d’ajouter ou de modifier les données Question, Secteur d’Activité et Application Odoo directement depuis un formulaire de l’application. Etant donné les liaisons de chaque table de ma base de données, un ajout ou une modification de ce type donnée doit faire partie d’un cheminement global prenant en les incidences sur les autres tables.</w:t>
       </w:r>
     </w:p>
     <w:p>
@@ -6705,277 +7472,76 @@
         <w:pStyle w:val="Paragraphedeliste"/>
         <w:numPr>
           <w:ilvl w:val="0"/>
-          <w:numId w:val="11"/>
+          <w:numId w:val="14"/>
         </w:numPr>
-        <w:spacing w:before="60" w:after="60" w:line="240" w:lineRule="auto"/>
-        <w:contextualSpacing w:val="0"/>
-        <w:jc w:val="left"/>
-      </w:pPr>
-      <w:r>
-        <w:t>ApplicationOdoo — 65 applications Odoo disponibles</w:t>
-      </w:r>
-    </w:p>
-    <w:p>
-      <w:pPr>
-        <w:pStyle w:val="Paragraphedeliste"/>
-        <w:numPr>
-          <w:ilvl w:val="0"/>
-          <w:numId w:val="11"/>
-        </w:numPr>
-        <w:spacing w:before="60" w:after="60" w:line="240" w:lineRule="auto"/>
-        <w:contextualSpacing w:val="0"/>
-        <w:jc w:val="left"/>
-      </w:pPr>
-      <w:r>
-        <w:t>Client — 23 clients de démonstration</w:t>
-      </w:r>
-    </w:p>
-    <w:p>
-      <w:pPr>
-        <w:pStyle w:val="Paragraphedeliste"/>
-        <w:numPr>
-          <w:ilvl w:val="0"/>
-          <w:numId w:val="11"/>
-        </w:numPr>
-        <w:spacing w:before="60" w:after="60" w:line="240" w:lineRule="auto"/>
-        <w:contextualSpacing w:val="0"/>
-        <w:jc w:val="left"/>
-      </w:pPr>
-      <w:r>
-        <w:t>Questions — 54 questions du questionnaire dynamique</w:t>
-      </w:r>
-    </w:p>
-    <w:p>
-      <w:pPr>
-        <w:pStyle w:val="Paragraphedeliste"/>
-        <w:numPr>
-          <w:ilvl w:val="0"/>
-          <w:numId w:val="11"/>
-        </w:numPr>
-        <w:spacing w:before="60" w:after="60" w:line="240" w:lineRule="auto"/>
-        <w:contextualSpacing w:val="0"/>
-        <w:jc w:val="left"/>
-      </w:pPr>
-      <w:r>
-        <w:t>CreationListe — 66 liaisons question → application recommandée</w:t>
-      </w:r>
-    </w:p>
-    <w:p>
-      <w:pPr>
-        <w:spacing w:before="60" w:after="60" w:line="240" w:lineRule="auto"/>
-        <w:jc w:val="left"/>
-      </w:pPr>
-      <w:r>
-        <w:rPr>
-          <w:noProof/>
-          <w:color w:val="EE0000"/>
-        </w:rPr>
-        <w:drawing>
-          <wp:anchor distT="0" distB="0" distL="114300" distR="114300" simplePos="0" relativeHeight="251662336" behindDoc="1" locked="0" layoutInCell="1" allowOverlap="1" wp14:anchorId="7422F82B" wp14:editId="65946126">
-            <wp:simplePos x="0" y="0"/>
-            <wp:positionH relativeFrom="column">
-              <wp:posOffset>215059</wp:posOffset>
-            </wp:positionH>
-            <wp:positionV relativeFrom="paragraph">
-              <wp:posOffset>207403</wp:posOffset>
-            </wp:positionV>
-            <wp:extent cx="251460" cy="251460"/>
-            <wp:effectExtent l="0" t="0" r="0" b="0"/>
-            <wp:wrapNone/>
-            <wp:docPr id="400042533" name="Image 1" descr="The image depicts a vibrant, solid orange star shape.&#10;&#10;Le contenu généré par l’IA peut être incorrect."/>
-            <wp:cNvGraphicFramePr>
-              <a:graphicFrameLocks xmlns:a="http://schemas.openxmlformats.org/drawingml/2006/main" noChangeAspect="1"/>
-            </wp:cNvGraphicFramePr>
-            <a:graphic xmlns:a="http://schemas.openxmlformats.org/drawingml/2006/main">
-              <a:graphicData uri="http://schemas.openxmlformats.org/drawingml/2006/picture">
-                <pic:pic xmlns:pic="http://schemas.openxmlformats.org/drawingml/2006/picture">
-                  <pic:nvPicPr>
-                    <pic:cNvPr id="400042533" name="Image 1" descr="The image depicts a vibrant, solid orange star shape.&#10;&#10;Le contenu généré par l’IA peut être incorrect."/>
-                    <pic:cNvPicPr>
-                      <a:picLocks noChangeAspect="1" noChangeArrowheads="1"/>
-                    </pic:cNvPicPr>
-                  </pic:nvPicPr>
-                  <pic:blipFill>
-                    <a:blip r:embed="rId12">
-                      <a:extLst>
-                        <a:ext uri="{28A0092B-C50C-407E-A947-70E740481C1C}">
-                          <a14:useLocalDpi xmlns:a14="http://schemas.microsoft.com/office/drawing/2010/main" val="0"/>
-                        </a:ext>
-                      </a:extLst>
-                    </a:blip>
-                    <a:srcRect/>
-                    <a:stretch>
-                      <a:fillRect/>
-                    </a:stretch>
-                  </pic:blipFill>
-                  <pic:spPr bwMode="auto">
-                    <a:xfrm>
-                      <a:off x="0" y="0"/>
-                      <a:ext cx="251460" cy="251460"/>
-                    </a:xfrm>
-                    <a:prstGeom prst="rect">
-                      <a:avLst/>
-                    </a:prstGeom>
-                    <a:noFill/>
-                    <a:ln>
-                      <a:noFill/>
-                    </a:ln>
-                  </pic:spPr>
-                </pic:pic>
-              </a:graphicData>
-            </a:graphic>
-            <wp14:sizeRelH relativeFrom="margin">
-              <wp14:pctWidth>0</wp14:pctWidth>
-            </wp14:sizeRelH>
-            <wp14:sizeRelV relativeFrom="margin">
-              <wp14:pctHeight>0</wp14:pctHeight>
-            </wp14:sizeRelV>
-          </wp:anchor>
-        </w:drawing>
-      </w:r>
-    </w:p>
-    <w:p>
-      <w:pPr>
-        <w:spacing w:before="100" w:after="100"/>
-        <w:jc w:val="center"/>
-        <w:rPr>
-          <w:color w:val="D97757"/>
-        </w:rPr>
-      </w:pPr>
-      <w:r>
-        <w:rPr>
-          <w:color w:val="D97757"/>
-        </w:rPr>
-        <w:t xml:space="preserve">Le </w:t>
-      </w:r>
-      <w:r>
-        <w:rPr>
-          <w:color w:val="D97757"/>
-        </w:rPr>
-        <w:t>script SQL d’importation a été généré par Claude AI à partir du fichier Excel</w:t>
+      </w:pPr>
+      <w:r>
+        <w:t xml:space="preserve">Une fonctionnalité supplémentaire et importantes pour le long terme serait également de prévoir un calcul d’heure d’implémentation. Chaque application est différente et nécessite un certain nombre d’heure pour être implémentée chez nos clients. La difficulté réside dans l’interconnectivité des applications. Etant un ERP intégré, une application Odoo peut ou non communique avec une ou plusieurs autres applications. Ces dépendances ont une incidence concrète sur le </w:t>
+      </w:r>
+      <w:r>
+        <w:t>paramétrage</w:t>
+      </w:r>
+      <w:r>
+        <w:t xml:space="preserve"> de l’application et </w:t>
+      </w:r>
+      <w:r>
+        <w:t>fatalement sur les heures devant être prévue pour l’implémentation. Ce total calculé nous permettra de pouvoir plus aisément chiffrer un devis à nos clients et leur donner au moins une idée budgétaire de l’implémentation.</w:t>
+      </w:r>
+    </w:p>
+    <w:p>
+      <w:pPr>
+        <w:pStyle w:val="Titre3"/>
+      </w:pPr>
+      <w:r>
+        <w:t>Moyen terme</w:t>
+      </w:r>
+    </w:p>
+    <w:p>
+      <w:r>
+        <w:t>J’ai reçu un objectif de la part de blackbox de faire évoluer mon application afin de la rendre utilisable par nos clients. Elle serait disponible sur notre site internet et permettr</w:t>
+      </w:r>
+      <w:r>
+        <w:t>a</w:t>
+      </w:r>
+      <w:r>
+        <w:t xml:space="preserve"> aux clients intéressés par une intégration Odoo de pouvoir </w:t>
+      </w:r>
+      <w:r>
+        <w:t>évaluer le budget</w:t>
+      </w:r>
+      <w:r>
+        <w:t xml:space="preserve"> de l’intégration tout en promouvant les capacités du logiciel. Les questions devront donc être adaptée sur la forme afin d’avoir une version plus vendeuse.</w:t>
+      </w:r>
+    </w:p>
+    <w:p>
+      <w:r>
+        <w:t xml:space="preserve">Un autre objectif serait de traduire le code en </w:t>
+      </w:r>
+      <w:proofErr w:type="spellStart"/>
+      <w:r>
+        <w:t>Pyhton</w:t>
+      </w:r>
+      <w:proofErr w:type="spellEnd"/>
+      <w:r>
+        <w:t xml:space="preserve"> afin de pouvoir l’intégrer directement à l’environnement Odoo. Ceci </w:t>
+      </w:r>
+      <w:r>
+        <w:t>permettra</w:t>
+      </w:r>
+      <w:r>
+        <w:t xml:space="preserve"> de pouvoir le rendre disponible à d’autres intégrateurs</w:t>
+      </w:r>
+      <w:r>
+        <w:t xml:space="preserve"> Suisses</w:t>
+      </w:r>
+      <w:r>
+        <w:t xml:space="preserve"> en suisse par le téléchargement de l’application sur le magasin d’application de la communauté Odoo.</w:t>
       </w:r>
     </w:p>
     <w:p/>
-    <w:p>
-      <w:pPr>
-        <w:pStyle w:val="Titre2"/>
-      </w:pPr>
-      <w:bookmarkStart w:id="23" w:name="_Toc229378742"/>
-      <w:r>
-        <w:t>Programmation</w:t>
-      </w:r>
-      <w:bookmarkEnd w:id="23"/>
-    </w:p>
-    <w:p>
-      <w:pPr>
-        <w:pStyle w:val="Titre3"/>
-      </w:pPr>
-      <w:r>
-        <w:t>Outils utilisés</w:t>
-      </w:r>
-    </w:p>
-    <w:p/>
-    <w:p>
-      <w:pPr>
-        <w:pStyle w:val="Titre3"/>
-      </w:pPr>
-      <w:r>
-        <w:t>Logique de code</w:t>
-      </w:r>
-    </w:p>
-    <w:p>
-      <w:r>
-        <w:t>Login/sans login</w:t>
-      </w:r>
-    </w:p>
-    <w:p>
-      <w:r>
-        <w:t>Sera implémenter directement dans Odoo dans le futur, le programme sera donc derrière le login Odoo donc pas besoins de faire une page de login.</w:t>
-      </w:r>
-    </w:p>
-    <w:p>
-      <w:pPr>
-        <w:pStyle w:val="Titre2"/>
-      </w:pPr>
-      <w:bookmarkStart w:id="24" w:name="_Toc229378744"/>
-      <w:r>
-        <w:t>Visuels</w:t>
-      </w:r>
-      <w:bookmarkEnd w:id="24"/>
-    </w:p>
-    <w:p>
-      <w:pPr>
-        <w:pStyle w:val="Titre3"/>
-      </w:pPr>
-      <w:bookmarkStart w:id="25" w:name="_Toc229378745"/>
-      <w:r>
-        <w:t>Choix visuels</w:t>
-      </w:r>
-      <w:bookmarkEnd w:id="25"/>
-    </w:p>
-    <w:p/>
-    <w:p>
-      <w:pPr>
-        <w:pStyle w:val="Titre3"/>
-      </w:pPr>
-      <w:bookmarkStart w:id="26" w:name="_Toc229378746"/>
-      <w:r>
-        <w:t>Bibliothèque et ressources</w:t>
-      </w:r>
-      <w:bookmarkEnd w:id="26"/>
-    </w:p>
-    <w:p/>
-    <w:p>
-      <w:pPr>
-        <w:pStyle w:val="Titre2"/>
-      </w:pPr>
-      <w:bookmarkStart w:id="27" w:name="_Toc229378747"/>
-      <w:r>
-        <w:t>Mode d’emplois</w:t>
-      </w:r>
-      <w:bookmarkEnd w:id="27"/>
-    </w:p>
-    <w:p/>
-    <w:p>
-      <w:pPr>
-        <w:pStyle w:val="Titre2"/>
-      </w:pPr>
-      <w:bookmarkStart w:id="28" w:name="_Toc229378748"/>
-      <w:r>
-        <w:lastRenderedPageBreak/>
-        <w:t>Evolutions futures</w:t>
-      </w:r>
-      <w:bookmarkEnd w:id="28"/>
-    </w:p>
-    <w:p>
-      <w:pPr>
-        <w:pStyle w:val="Titre3"/>
-      </w:pPr>
-      <w:bookmarkStart w:id="29" w:name="_Toc229378749"/>
-      <w:r>
-        <w:t>Orienté client</w:t>
-      </w:r>
-      <w:bookmarkEnd w:id="29"/>
-      <w:r>
-        <w:t xml:space="preserve"> et devis automatisés</w:t>
-      </w:r>
-    </w:p>
-    <w:p>
-      <w:r>
-        <w:t xml:space="preserve">Nous avons comme futur objectif d’adapter le questionnaire afin de rendre plus adapté à une utilisation par les clients potentiels de blackbox. L’objectif d’amélioration est de pourvoir, en fonction des réponses, proposer non seulement une liste d’application nécessaire avec une vue commerciale de l’utilisation d’Odoo avec des processus de travail expliqués probablement en vidéo afin de démontrer son utilisation en condition réelle. De plus, une automatisation directe dans le CRM Odoo pourra nous permettre de proposer rapidement selon les informations remplies un devis provisoire du tarif de l’intégration et </w:t>
-      </w:r>
-      <w:r>
-        <w:t>des licences.</w:t>
-      </w:r>
-    </w:p>
-    <w:p>
-      <w:r>
-        <w:t>L’application sera alors publiée directement sur le site de blackbox.</w:t>
-      </w:r>
-    </w:p>
     <w:sectPr>
-      <w:headerReference w:type="default" r:id="rId13"/>
-      <w:footerReference w:type="default" r:id="rId14"/>
+      <w:headerReference w:type="default" r:id="rId14"/>
+      <w:footerReference w:type="default" r:id="rId15"/>
       <w:endnotePr>
         <w:numFmt w:val="upperRoman"/>
       </w:endnotePr>
@@ -7019,10 +7585,7 @@
         <w:endnoteRef/>
       </w:r>
       <w:r>
-        <w:t xml:space="preserve"> </w:t>
-      </w:r>
-      <w:r>
-        <w:t>https://www.odoo.com/fr_FR</w:t>
+        <w:t xml:space="preserve"> https://www.bkbx.ch/</w:t>
       </w:r>
     </w:p>
   </w:endnote>
@@ -7044,7 +7607,7 @@
         <w:t xml:space="preserve"> </w:t>
       </w:r>
       <w:r>
-        <w:t>https://app.diagrams.net/</w:t>
+        <w:t>https://www.odoo.com/fr_FR</w:t>
       </w:r>
     </w:p>
   </w:endnote>
@@ -7066,7 +7629,76 @@
         <w:t xml:space="preserve"> </w:t>
       </w:r>
       <w:r>
+        <w:t>https://app.diagrams.net/</w:t>
+      </w:r>
+    </w:p>
+  </w:endnote>
+  <w:endnote w:id="4">
+    <w:p>
+      <w:pPr>
+        <w:pStyle w:val="Notedefin"/>
+        <w:rPr>
+          <w:lang w:val="fr-FR"/>
+        </w:rPr>
+      </w:pPr>
+      <w:r>
+        <w:rPr>
+          <w:rStyle w:val="Appeldenotedefin"/>
+        </w:rPr>
+        <w:endnoteRef/>
+      </w:r>
+      <w:r>
+        <w:t xml:space="preserve"> </w:t>
+      </w:r>
+      <w:r>
         <w:t>https://www.dbdesigner.net/</w:t>
+      </w:r>
+    </w:p>
+  </w:endnote>
+  <w:endnote w:id="5">
+    <w:p>
+      <w:pPr>
+        <w:pStyle w:val="Notedefin"/>
+        <w:rPr>
+          <w:lang w:val="fr-FR"/>
+        </w:rPr>
+      </w:pPr>
+      <w:r>
+        <w:rPr>
+          <w:rStyle w:val="Appeldenotedefin"/>
+        </w:rPr>
+        <w:endnoteRef/>
+      </w:r>
+      <w:r>
+        <w:t xml:space="preserve"> </w:t>
+      </w:r>
+      <w:r>
+        <w:t>https://www.docker.com/</w:t>
+      </w:r>
+    </w:p>
+  </w:endnote>
+  <w:endnote w:id="6">
+    <w:p>
+      <w:pPr>
+        <w:pStyle w:val="Notedefin"/>
+        <w:rPr>
+          <w:lang w:val="fr-FR"/>
+        </w:rPr>
+      </w:pPr>
+      <w:r>
+        <w:rPr>
+          <w:rStyle w:val="Appeldenotedefin"/>
+        </w:rPr>
+        <w:endnoteRef/>
+      </w:r>
+      <w:r>
+        <w:t xml:space="preserve"> </w:t>
+      </w:r>
+      <w:r>
+        <w:t>https://claude.ai</w:t>
+      </w:r>
+      <w:r>
+        <w:t>/</w:t>
       </w:r>
     </w:p>
   </w:endnote>
@@ -7306,6 +7938,95 @@
 <file path=word/numbering.xml><?xml version="1.0" encoding="utf-8"?>
 <w:numbering xmlns:wpc="http://schemas.microsoft.com/office/word/2010/wordprocessingCanvas" xmlns:cx="http://schemas.microsoft.com/office/drawing/2014/chartex" xmlns:cx1="http://schemas.microsoft.com/office/drawing/2015/9/8/chartex" xmlns:cx2="http://schemas.microsoft.com/office/drawing/2015/10/21/chartex" xmlns:cx3="http://schemas.microsoft.com/office/drawing/2016/5/9/chartex" xmlns:cx4="http://schemas.microsoft.com/office/drawing/2016/5/10/chartex" xmlns:cx5="http://schemas.microsoft.com/office/drawing/2016/5/11/chartex" xmlns:cx6="http://schemas.microsoft.com/office/drawing/2016/5/12/chartex" xmlns:cx7="http://schemas.microsoft.com/office/drawing/2016/5/13/chartex" xmlns:cx8="http://schemas.microsoft.com/office/drawing/2016/5/14/chartex" xmlns:mc="http://schemas.openxmlformats.org/markup-compatibility/2006" xmlns:aink="http://schemas.microsoft.com/office/drawing/2016/ink" xmlns:am3d="http://schemas.microsoft.com/office/drawing/2017/model3d" xmlns:o="urn:schemas-microsoft-com:office:office" xmlns:oel="http://schemas.microsoft.com/office/2019/extlst" xmlns:r="http://schemas.openxmlformats.org/officeDocument/2006/relationships" xmlns:m="http://schemas.openxmlformats.org/officeDocument/2006/math" xmlns:v="urn:schemas-microsoft-com:vml" xmlns:wp14="http://schemas.microsoft.com/office/word/2010/wordprocessingDrawing" xmlns:wp="http://schemas.openxmlformats.org/drawingml/2006/wordprocessingDrawing" xmlns:w10="urn:schemas-microsoft-com:office:word" xmlns:w="http://schemas.openxmlformats.org/wordprocessingml/2006/main" xmlns:w14="http://schemas.microsoft.com/office/word/2010/wordml" xmlns:w15="http://schemas.microsoft.com/office/word/2012/wordml" xmlns:w16cex="http://schemas.microsoft.com/office/word/2018/wordml/cex" xmlns:w16cid="http://schemas.microsoft.com/office/word/2016/wordml/cid" xmlns:w16="http://schemas.microsoft.com/office/word/2018/wordml" xmlns:w16du="http://schemas.microsoft.com/office/word/2023/wordml/word16du" xmlns:w16sdtdh="http://schemas.microsoft.com/office/word/2020/wordml/sdtdatahash" xmlns:w16sdtfl="http://schemas.microsoft.com/office/word/2024/wordml/sdtformatlock" xmlns:w16se="http://schemas.microsoft.com/office/word/2015/wordml/symex" xmlns:wpg="http://schemas.microsoft.com/office/word/2010/wordprocessingGroup" xmlns:wpi="http://schemas.microsoft.com/office/word/2010/wordprocessingInk" xmlns:wne="http://schemas.microsoft.com/office/word/2006/wordml" xmlns:wps="http://schemas.microsoft.com/office/word/2010/wordprocessingShape" mc:Ignorable="w14 w15 w16se w16cid w16 w16cex w16sdtdh w16sdtfl w16du wp14">
   <w:abstractNum w:abstractNumId="0" w15:restartNumberingAfterBreak="0">
+    <w:nsid w:val="11290BF8"/>
+    <w:multiLevelType w:val="hybridMultilevel"/>
+    <w:tmpl w:val="2D0696BE"/>
+    <w:lvl w:ilvl="0" w:tplc="100C000F">
+      <w:start w:val="1"/>
+      <w:numFmt w:val="decimal"/>
+      <w:lvlText w:val="%1."/>
+      <w:lvlJc w:val="left"/>
+      <w:pPr>
+        <w:ind w:left="720" w:hanging="360"/>
+      </w:pPr>
+      <w:rPr>
+        <w:rFonts w:hint="default"/>
+      </w:rPr>
+    </w:lvl>
+    <w:lvl w:ilvl="1" w:tplc="100C0019" w:tentative="1">
+      <w:start w:val="1"/>
+      <w:numFmt w:val="lowerLetter"/>
+      <w:lvlText w:val="%2."/>
+      <w:lvlJc w:val="left"/>
+      <w:pPr>
+        <w:ind w:left="1440" w:hanging="360"/>
+      </w:pPr>
+    </w:lvl>
+    <w:lvl w:ilvl="2" w:tplc="100C001B" w:tentative="1">
+      <w:start w:val="1"/>
+      <w:numFmt w:val="lowerRoman"/>
+      <w:lvlText w:val="%3."/>
+      <w:lvlJc w:val="right"/>
+      <w:pPr>
+        <w:ind w:left="2160" w:hanging="180"/>
+      </w:pPr>
+    </w:lvl>
+    <w:lvl w:ilvl="3" w:tplc="100C000F" w:tentative="1">
+      <w:start w:val="1"/>
+      <w:numFmt w:val="decimal"/>
+      <w:lvlText w:val="%4."/>
+      <w:lvlJc w:val="left"/>
+      <w:pPr>
+        <w:ind w:left="2880" w:hanging="360"/>
+      </w:pPr>
+    </w:lvl>
+    <w:lvl w:ilvl="4" w:tplc="100C0019" w:tentative="1">
+      <w:start w:val="1"/>
+      <w:numFmt w:val="lowerLetter"/>
+      <w:lvlText w:val="%5."/>
+      <w:lvlJc w:val="left"/>
+      <w:pPr>
+        <w:ind w:left="3600" w:hanging="360"/>
+      </w:pPr>
+    </w:lvl>
+    <w:lvl w:ilvl="5" w:tplc="100C001B" w:tentative="1">
+      <w:start w:val="1"/>
+      <w:numFmt w:val="lowerRoman"/>
+      <w:lvlText w:val="%6."/>
+      <w:lvlJc w:val="right"/>
+      <w:pPr>
+        <w:ind w:left="4320" w:hanging="180"/>
+      </w:pPr>
+    </w:lvl>
+    <w:lvl w:ilvl="6" w:tplc="100C000F" w:tentative="1">
+      <w:start w:val="1"/>
+      <w:numFmt w:val="decimal"/>
+      <w:lvlText w:val="%7."/>
+      <w:lvlJc w:val="left"/>
+      <w:pPr>
+        <w:ind w:left="5040" w:hanging="360"/>
+      </w:pPr>
+    </w:lvl>
+    <w:lvl w:ilvl="7" w:tplc="100C0019" w:tentative="1">
+      <w:start w:val="1"/>
+      <w:numFmt w:val="lowerLetter"/>
+      <w:lvlText w:val="%8."/>
+      <w:lvlJc w:val="left"/>
+      <w:pPr>
+        <w:ind w:left="5760" w:hanging="360"/>
+      </w:pPr>
+    </w:lvl>
+    <w:lvl w:ilvl="8" w:tplc="100C001B" w:tentative="1">
+      <w:start w:val="1"/>
+      <w:numFmt w:val="lowerRoman"/>
+      <w:lvlText w:val="%9."/>
+      <w:lvlJc w:val="right"/>
+      <w:pPr>
+        <w:ind w:left="6480" w:hanging="180"/>
+      </w:pPr>
+    </w:lvl>
+  </w:abstractNum>
+  <w:abstractNum w:abstractNumId="1" w15:restartNumberingAfterBreak="0">
     <w:nsid w:val="1B264581"/>
     <w:multiLevelType w:val="hybridMultilevel"/>
     <w:tmpl w:val="ECD8A968"/>
@@ -7417,7 +8138,7 @@
       </w:rPr>
     </w:lvl>
   </w:abstractNum>
-  <w:abstractNum w:abstractNumId="1" w15:restartNumberingAfterBreak="0">
+  <w:abstractNum w:abstractNumId="2" w15:restartNumberingAfterBreak="0">
     <w:nsid w:val="211278F2"/>
     <w:multiLevelType w:val="hybridMultilevel"/>
     <w:tmpl w:val="12EAEDE2"/>
@@ -7506,7 +8227,7 @@
       </w:pPr>
     </w:lvl>
   </w:abstractNum>
-  <w:abstractNum w:abstractNumId="2" w15:restartNumberingAfterBreak="0">
+  <w:abstractNum w:abstractNumId="3" w15:restartNumberingAfterBreak="0">
     <w:nsid w:val="271E7039"/>
     <w:multiLevelType w:val="multilevel"/>
     <w:tmpl w:val="376A6B08"/>
@@ -7655,7 +8376,7 @@
       </w:rPr>
     </w:lvl>
   </w:abstractNum>
-  <w:abstractNum w:abstractNumId="3" w15:restartNumberingAfterBreak="0">
+  <w:abstractNum w:abstractNumId="4" w15:restartNumberingAfterBreak="0">
     <w:nsid w:val="3B94578D"/>
     <w:multiLevelType w:val="multilevel"/>
     <w:tmpl w:val="0D804CD8"/>
@@ -7804,7 +8525,7 @@
       </w:rPr>
     </w:lvl>
   </w:abstractNum>
-  <w:abstractNum w:abstractNumId="4" w15:restartNumberingAfterBreak="0">
+  <w:abstractNum w:abstractNumId="5" w15:restartNumberingAfterBreak="0">
     <w:nsid w:val="40570204"/>
     <w:multiLevelType w:val="hybridMultilevel"/>
     <w:tmpl w:val="8C54F546"/>
@@ -7916,7 +8637,7 @@
       </w:rPr>
     </w:lvl>
   </w:abstractNum>
-  <w:abstractNum w:abstractNumId="5" w15:restartNumberingAfterBreak="0">
+  <w:abstractNum w:abstractNumId="6" w15:restartNumberingAfterBreak="0">
     <w:nsid w:val="451218D2"/>
     <w:multiLevelType w:val="hybridMultilevel"/>
     <w:tmpl w:val="AD1CB034"/>
@@ -8002,7 +8723,7 @@
       </w:pPr>
     </w:lvl>
   </w:abstractNum>
-  <w:abstractNum w:abstractNumId="6" w15:restartNumberingAfterBreak="0">
+  <w:abstractNum w:abstractNumId="7" w15:restartNumberingAfterBreak="0">
     <w:nsid w:val="490E52CB"/>
     <w:multiLevelType w:val="hybridMultilevel"/>
     <w:tmpl w:val="9628158C"/>
@@ -8114,7 +8835,96 @@
       </w:rPr>
     </w:lvl>
   </w:abstractNum>
-  <w:abstractNum w:abstractNumId="7" w15:restartNumberingAfterBreak="0">
+  <w:abstractNum w:abstractNumId="8" w15:restartNumberingAfterBreak="0">
+    <w:nsid w:val="57AB70B8"/>
+    <w:multiLevelType w:val="hybridMultilevel"/>
+    <w:tmpl w:val="B0CE61C0"/>
+    <w:lvl w:ilvl="0" w:tplc="100C000F">
+      <w:start w:val="1"/>
+      <w:numFmt w:val="decimal"/>
+      <w:lvlText w:val="%1."/>
+      <w:lvlJc w:val="left"/>
+      <w:pPr>
+        <w:ind w:left="720" w:hanging="360"/>
+      </w:pPr>
+      <w:rPr>
+        <w:rFonts w:hint="default"/>
+      </w:rPr>
+    </w:lvl>
+    <w:lvl w:ilvl="1" w:tplc="100C0019" w:tentative="1">
+      <w:start w:val="1"/>
+      <w:numFmt w:val="lowerLetter"/>
+      <w:lvlText w:val="%2."/>
+      <w:lvlJc w:val="left"/>
+      <w:pPr>
+        <w:ind w:left="1440" w:hanging="360"/>
+      </w:pPr>
+    </w:lvl>
+    <w:lvl w:ilvl="2" w:tplc="100C001B" w:tentative="1">
+      <w:start w:val="1"/>
+      <w:numFmt w:val="lowerRoman"/>
+      <w:lvlText w:val="%3."/>
+      <w:lvlJc w:val="right"/>
+      <w:pPr>
+        <w:ind w:left="2160" w:hanging="180"/>
+      </w:pPr>
+    </w:lvl>
+    <w:lvl w:ilvl="3" w:tplc="100C000F" w:tentative="1">
+      <w:start w:val="1"/>
+      <w:numFmt w:val="decimal"/>
+      <w:lvlText w:val="%4."/>
+      <w:lvlJc w:val="left"/>
+      <w:pPr>
+        <w:ind w:left="2880" w:hanging="360"/>
+      </w:pPr>
+    </w:lvl>
+    <w:lvl w:ilvl="4" w:tplc="100C0019" w:tentative="1">
+      <w:start w:val="1"/>
+      <w:numFmt w:val="lowerLetter"/>
+      <w:lvlText w:val="%5."/>
+      <w:lvlJc w:val="left"/>
+      <w:pPr>
+        <w:ind w:left="3600" w:hanging="360"/>
+      </w:pPr>
+    </w:lvl>
+    <w:lvl w:ilvl="5" w:tplc="100C001B" w:tentative="1">
+      <w:start w:val="1"/>
+      <w:numFmt w:val="lowerRoman"/>
+      <w:lvlText w:val="%6."/>
+      <w:lvlJc w:val="right"/>
+      <w:pPr>
+        <w:ind w:left="4320" w:hanging="180"/>
+      </w:pPr>
+    </w:lvl>
+    <w:lvl w:ilvl="6" w:tplc="100C000F" w:tentative="1">
+      <w:start w:val="1"/>
+      <w:numFmt w:val="decimal"/>
+      <w:lvlText w:val="%7."/>
+      <w:lvlJc w:val="left"/>
+      <w:pPr>
+        <w:ind w:left="5040" w:hanging="360"/>
+      </w:pPr>
+    </w:lvl>
+    <w:lvl w:ilvl="7" w:tplc="100C0019" w:tentative="1">
+      <w:start w:val="1"/>
+      <w:numFmt w:val="lowerLetter"/>
+      <w:lvlText w:val="%8."/>
+      <w:lvlJc w:val="left"/>
+      <w:pPr>
+        <w:ind w:left="5760" w:hanging="360"/>
+      </w:pPr>
+    </w:lvl>
+    <w:lvl w:ilvl="8" w:tplc="100C001B" w:tentative="1">
+      <w:start w:val="1"/>
+      <w:numFmt w:val="lowerRoman"/>
+      <w:lvlText w:val="%9."/>
+      <w:lvlJc w:val="right"/>
+      <w:pPr>
+        <w:ind w:left="6480" w:hanging="180"/>
+      </w:pPr>
+    </w:lvl>
+  </w:abstractNum>
+  <w:abstractNum w:abstractNumId="9" w15:restartNumberingAfterBreak="0">
     <w:nsid w:val="5847588E"/>
     <w:multiLevelType w:val="hybridMultilevel"/>
     <w:tmpl w:val="05E2087C"/>
@@ -8200,7 +9010,7 @@
       </w:pPr>
     </w:lvl>
   </w:abstractNum>
-  <w:abstractNum w:abstractNumId="8" w15:restartNumberingAfterBreak="0">
+  <w:abstractNum w:abstractNumId="10" w15:restartNumberingAfterBreak="0">
     <w:nsid w:val="5AA81A73"/>
     <w:multiLevelType w:val="multilevel"/>
     <w:tmpl w:val="CC3235D0"/>
@@ -8349,7 +9159,96 @@
       </w:rPr>
     </w:lvl>
   </w:abstractNum>
-  <w:abstractNum w:abstractNumId="9" w15:restartNumberingAfterBreak="0">
+  <w:abstractNum w:abstractNumId="11" w15:restartNumberingAfterBreak="0">
+    <w:nsid w:val="5C910322"/>
+    <w:multiLevelType w:val="hybridMultilevel"/>
+    <w:tmpl w:val="1A78CF3E"/>
+    <w:lvl w:ilvl="0" w:tplc="100C000F">
+      <w:start w:val="1"/>
+      <w:numFmt w:val="decimal"/>
+      <w:lvlText w:val="%1."/>
+      <w:lvlJc w:val="left"/>
+      <w:pPr>
+        <w:ind w:left="720" w:hanging="360"/>
+      </w:pPr>
+      <w:rPr>
+        <w:rFonts w:hint="default"/>
+      </w:rPr>
+    </w:lvl>
+    <w:lvl w:ilvl="1" w:tplc="100C0019" w:tentative="1">
+      <w:start w:val="1"/>
+      <w:numFmt w:val="lowerLetter"/>
+      <w:lvlText w:val="%2."/>
+      <w:lvlJc w:val="left"/>
+      <w:pPr>
+        <w:ind w:left="1440" w:hanging="360"/>
+      </w:pPr>
+    </w:lvl>
+    <w:lvl w:ilvl="2" w:tplc="100C001B" w:tentative="1">
+      <w:start w:val="1"/>
+      <w:numFmt w:val="lowerRoman"/>
+      <w:lvlText w:val="%3."/>
+      <w:lvlJc w:val="right"/>
+      <w:pPr>
+        <w:ind w:left="2160" w:hanging="180"/>
+      </w:pPr>
+    </w:lvl>
+    <w:lvl w:ilvl="3" w:tplc="100C000F" w:tentative="1">
+      <w:start w:val="1"/>
+      <w:numFmt w:val="decimal"/>
+      <w:lvlText w:val="%4."/>
+      <w:lvlJc w:val="left"/>
+      <w:pPr>
+        <w:ind w:left="2880" w:hanging="360"/>
+      </w:pPr>
+    </w:lvl>
+    <w:lvl w:ilvl="4" w:tplc="100C0019" w:tentative="1">
+      <w:start w:val="1"/>
+      <w:numFmt w:val="lowerLetter"/>
+      <w:lvlText w:val="%5."/>
+      <w:lvlJc w:val="left"/>
+      <w:pPr>
+        <w:ind w:left="3600" w:hanging="360"/>
+      </w:pPr>
+    </w:lvl>
+    <w:lvl w:ilvl="5" w:tplc="100C001B" w:tentative="1">
+      <w:start w:val="1"/>
+      <w:numFmt w:val="lowerRoman"/>
+      <w:lvlText w:val="%6."/>
+      <w:lvlJc w:val="right"/>
+      <w:pPr>
+        <w:ind w:left="4320" w:hanging="180"/>
+      </w:pPr>
+    </w:lvl>
+    <w:lvl w:ilvl="6" w:tplc="100C000F" w:tentative="1">
+      <w:start w:val="1"/>
+      <w:numFmt w:val="decimal"/>
+      <w:lvlText w:val="%7."/>
+      <w:lvlJc w:val="left"/>
+      <w:pPr>
+        <w:ind w:left="5040" w:hanging="360"/>
+      </w:pPr>
+    </w:lvl>
+    <w:lvl w:ilvl="7" w:tplc="100C0019" w:tentative="1">
+      <w:start w:val="1"/>
+      <w:numFmt w:val="lowerLetter"/>
+      <w:lvlText w:val="%8."/>
+      <w:lvlJc w:val="left"/>
+      <w:pPr>
+        <w:ind w:left="5760" w:hanging="360"/>
+      </w:pPr>
+    </w:lvl>
+    <w:lvl w:ilvl="8" w:tplc="100C001B" w:tentative="1">
+      <w:start w:val="1"/>
+      <w:numFmt w:val="lowerRoman"/>
+      <w:lvlText w:val="%9."/>
+      <w:lvlJc w:val="right"/>
+      <w:pPr>
+        <w:ind w:left="6480" w:hanging="180"/>
+      </w:pPr>
+    </w:lvl>
+  </w:abstractNum>
+  <w:abstractNum w:abstractNumId="12" w15:restartNumberingAfterBreak="0">
     <w:nsid w:val="6748112B"/>
     <w:multiLevelType w:val="hybridMultilevel"/>
     <w:tmpl w:val="A82662D0"/>
@@ -8403,7 +9302,7 @@
       <w:lvlJc w:val="left"/>
     </w:lvl>
   </w:abstractNum>
-  <w:abstractNum w:abstractNumId="10" w15:restartNumberingAfterBreak="0">
+  <w:abstractNum w:abstractNumId="13" w15:restartNumberingAfterBreak="0">
     <w:nsid w:val="7F06697B"/>
     <w:multiLevelType w:val="hybridMultilevel"/>
     <w:tmpl w:val="12EAEDE2"/>
@@ -8493,40 +9392,49 @@
     </w:lvl>
   </w:abstractNum>
   <w:num w:numId="1" w16cid:durableId="808863684">
+    <w:abstractNumId w:val="5"/>
+  </w:num>
+  <w:num w:numId="2" w16cid:durableId="1085103623">
     <w:abstractNumId w:val="4"/>
   </w:num>
-  <w:num w:numId="2" w16cid:durableId="1085103623">
+  <w:num w:numId="3" w16cid:durableId="213810979">
+    <w:abstractNumId w:val="1"/>
+  </w:num>
+  <w:num w:numId="4" w16cid:durableId="1326780895">
     <w:abstractNumId w:val="3"/>
   </w:num>
-  <w:num w:numId="3" w16cid:durableId="213810979">
-    <w:abstractNumId w:val="0"/>
+  <w:num w:numId="5" w16cid:durableId="2133862049">
+    <w:abstractNumId w:val="10"/>
   </w:num>
-  <w:num w:numId="4" w16cid:durableId="1326780895">
+  <w:num w:numId="6" w16cid:durableId="1133984050">
+    <w:abstractNumId w:val="7"/>
+  </w:num>
+  <w:num w:numId="7" w16cid:durableId="1769615723">
+    <w:abstractNumId w:val="13"/>
+  </w:num>
+  <w:num w:numId="8" w16cid:durableId="748507248">
     <w:abstractNumId w:val="2"/>
   </w:num>
-  <w:num w:numId="5" w16cid:durableId="2133862049">
-    <w:abstractNumId w:val="8"/>
-  </w:num>
-  <w:num w:numId="6" w16cid:durableId="1133984050">
+  <w:num w:numId="9" w16cid:durableId="1159273748">
     <w:abstractNumId w:val="6"/>
   </w:num>
-  <w:num w:numId="7" w16cid:durableId="1769615723">
-    <w:abstractNumId w:val="10"/>
-  </w:num>
-  <w:num w:numId="8" w16cid:durableId="748507248">
-    <w:abstractNumId w:val="1"/>
-  </w:num>
-  <w:num w:numId="9" w16cid:durableId="1159273748">
-    <w:abstractNumId w:val="5"/>
-  </w:num>
   <w:num w:numId="10" w16cid:durableId="1577934876">
-    <w:abstractNumId w:val="7"/>
+    <w:abstractNumId w:val="9"/>
   </w:num>
   <w:num w:numId="11" w16cid:durableId="1955598905">
-    <w:abstractNumId w:val="9"/>
+    <w:abstractNumId w:val="12"/>
     <w:lvlOverride w:ilvl="0">
       <w:startOverride w:val="1"/>
     </w:lvlOverride>
+  </w:num>
+  <w:num w:numId="12" w16cid:durableId="728960105">
+    <w:abstractNumId w:val="8"/>
+  </w:num>
+  <w:num w:numId="13" w16cid:durableId="46611873">
+    <w:abstractNumId w:val="0"/>
+  </w:num>
+  <w:num w:numId="14" w16cid:durableId="562839032">
+    <w:abstractNumId w:val="11"/>
   </w:num>
 </w:numbering>
 </file>
@@ -8931,7 +9839,7 @@
   <w:style w:type="paragraph" w:default="1" w:styleId="Normal">
     <w:name w:val="Normal"/>
     <w:qFormat/>
-    <w:rsid w:val="00FE0409"/>
+    <w:rsid w:val="00990C14"/>
     <w:pPr>
       <w:jc w:val="both"/>
     </w:pPr>
@@ -10030,4 +10938,16 @@
     </a:ext>
   </a:extLst>
 </a:theme>
+</file>
+
+<file path=customXml/item1.xml><?xml version="1.0" encoding="utf-8"?>
+<b:Sources xmlns:b="http://schemas.openxmlformats.org/officeDocument/2006/bibliography" xmlns="http://schemas.openxmlformats.org/officeDocument/2006/bibliography" SelectedStyle="\APASixthEditionOfficeOnline.xsl" StyleName="APA" Version="6"/>
+</file>
+
+<file path=customXml/itemProps1.xml><?xml version="1.0" encoding="utf-8"?>
+<ds:datastoreItem xmlns:ds="http://schemas.openxmlformats.org/officeDocument/2006/customXml" ds:itemID="{DB1E3CEC-16A7-44AE-9A62-1665F369FAFF}">
+  <ds:schemaRefs>
+    <ds:schemaRef ds:uri="http://schemas.openxmlformats.org/officeDocument/2006/bibliography"/>
+  </ds:schemaRefs>
+</ds:datastoreItem>
 </file>
</xml_diff>